<commit_message>
docs: preserve EAUT logo and match exact cover page layout from user reference image
</commit_message>
<xml_diff>
--- a/DeTaiCNJ_Nhom7.docx
+++ b/DeTaiCNJ_Nhom7.docx
@@ -13,11 +13,340 @@
       </w:pPr>
       <w:r>
         <w:rPr>
-          <w:rFonts w:ascii="Times New Roman" w:hAnsi="Times New Roman"/>
-          <w:b w:val="0"/>
           <w:sz w:val="28"/>
         </w:rPr>
-        <w:t>TRƯỜNG ĐẠI HỌC CÔNG NGHỆ ĐÔNG Á</w:t>
+        <mc:AlternateContent>
+          <mc:Choice Requires="wpg">
+            <w:drawing>
+              <wp:anchor distT="0" distB="0" distL="0" distR="0" simplePos="0" relativeHeight="251659264" behindDoc="1" locked="0" layoutInCell="1" allowOverlap="1">
+                <wp:simplePos x="0" y="0"/>
+                <wp:positionH relativeFrom="page">
+                  <wp:posOffset>1022350</wp:posOffset>
+                </wp:positionH>
+                <wp:positionV relativeFrom="page">
+                  <wp:posOffset>902970</wp:posOffset>
+                </wp:positionV>
+                <wp:extent cx="5702300" cy="8855075"/>
+                <wp:effectExtent l="0" t="0" r="12700" b="3175"/>
+                <wp:wrapNone/>
+                <wp:docPr id="1" name="Group 1"/>
+                <wp:cNvGraphicFramePr/>
+                <a:graphic xmlns:a="http://schemas.openxmlformats.org/drawingml/2006/main">
+                  <a:graphicData uri="http://schemas.microsoft.com/office/word/2010/wordprocessingGroup">
+                    <wpg:wgp>
+                      <wpg:cNvGrpSpPr/>
+                      <wpg:grpSpPr>
+                        <a:xfrm>
+                          <a:off x="0" y="0"/>
+                          <a:ext cx="5702300" cy="8855075"/>
+                          <a:chOff x="0" y="0"/>
+                          <a:chExt cx="5702300" cy="8855075"/>
+                        </a:xfrm>
+                      </wpg:grpSpPr>
+                      <wps:wsp>
+                        <wps:cNvPr id="2" name="Graphic 2"/>
+                        <wps:cNvSpPr/>
+                        <wps:spPr>
+                          <a:xfrm>
+                            <a:off x="0" y="0"/>
+                            <a:ext cx="5702300" cy="8855075"/>
+                          </a:xfrm>
+                          <a:custGeom>
+                            <a:avLst/>
+                            <a:gdLst/>
+                            <a:ahLst/>
+                            <a:cxnLst/>
+                            <a:rect l="l" t="t" r="r" b="b"/>
+                            <a:pathLst>
+                              <a:path w="5702300" h="8855075">
+                                <a:moveTo>
+                                  <a:pt x="5662930" y="39370"/>
+                                </a:moveTo>
+                                <a:lnTo>
+                                  <a:pt x="39370" y="39370"/>
+                                </a:lnTo>
+                                <a:lnTo>
+                                  <a:pt x="39370" y="99060"/>
+                                </a:lnTo>
+                                <a:lnTo>
+                                  <a:pt x="39370" y="8756650"/>
+                                </a:lnTo>
+                                <a:lnTo>
+                                  <a:pt x="39370" y="8815070"/>
+                                </a:lnTo>
+                                <a:lnTo>
+                                  <a:pt x="5662930" y="8815070"/>
+                                </a:lnTo>
+                                <a:lnTo>
+                                  <a:pt x="5662930" y="8756650"/>
+                                </a:lnTo>
+                                <a:lnTo>
+                                  <a:pt x="98425" y="8756650"/>
+                                </a:lnTo>
+                                <a:lnTo>
+                                  <a:pt x="98425" y="99060"/>
+                                </a:lnTo>
+                                <a:lnTo>
+                                  <a:pt x="5603875" y="99060"/>
+                                </a:lnTo>
+                                <a:lnTo>
+                                  <a:pt x="5603875" y="8756332"/>
+                                </a:lnTo>
+                                <a:lnTo>
+                                  <a:pt x="5662930" y="8756332"/>
+                                </a:lnTo>
+                                <a:lnTo>
+                                  <a:pt x="5662930" y="99060"/>
+                                </a:lnTo>
+                                <a:lnTo>
+                                  <a:pt x="5662930" y="98742"/>
+                                </a:lnTo>
+                                <a:lnTo>
+                                  <a:pt x="5662930" y="39370"/>
+                                </a:lnTo>
+                                <a:close/>
+                              </a:path>
+                              <a:path w="5702300" h="8855075">
+                                <a:moveTo>
+                                  <a:pt x="5702300" y="0"/>
+                                </a:moveTo>
+                                <a:lnTo>
+                                  <a:pt x="0" y="0"/>
+                                </a:lnTo>
+                                <a:lnTo>
+                                  <a:pt x="0" y="20320"/>
+                                </a:lnTo>
+                                <a:lnTo>
+                                  <a:pt x="0" y="8835403"/>
+                                </a:lnTo>
+                                <a:lnTo>
+                                  <a:pt x="0" y="8854453"/>
+                                </a:lnTo>
+                                <a:lnTo>
+                                  <a:pt x="5702300" y="8854453"/>
+                                </a:lnTo>
+                                <a:lnTo>
+                                  <a:pt x="5702300" y="8835403"/>
+                                </a:lnTo>
+                                <a:lnTo>
+                                  <a:pt x="19685" y="8835403"/>
+                                </a:lnTo>
+                                <a:lnTo>
+                                  <a:pt x="19685" y="20320"/>
+                                </a:lnTo>
+                                <a:lnTo>
+                                  <a:pt x="5682615" y="20320"/>
+                                </a:lnTo>
+                                <a:lnTo>
+                                  <a:pt x="5682615" y="8835072"/>
+                                </a:lnTo>
+                                <a:lnTo>
+                                  <a:pt x="5702300" y="8835085"/>
+                                </a:lnTo>
+                                <a:lnTo>
+                                  <a:pt x="5702300" y="20320"/>
+                                </a:lnTo>
+                                <a:lnTo>
+                                  <a:pt x="5702300" y="20002"/>
+                                </a:lnTo>
+                                <a:lnTo>
+                                  <a:pt x="5702300" y="0"/>
+                                </a:lnTo>
+                                <a:close/>
+                              </a:path>
+                            </a:pathLst>
+                          </a:custGeom>
+                          <a:solidFill>
+                            <a:srgbClr val="000000"/>
+                          </a:solidFill>
+                        </wps:spPr>
+                        <wps:bodyPr wrap="square" lIns="0" tIns="0" rIns="0" bIns="0" rtlCol="0">
+                          <a:noAutofit/>
+                        </wps:bodyPr>
+                      </wps:wsp>
+                      <pic:pic xmlns:pic="http://schemas.openxmlformats.org/drawingml/2006/picture">
+                        <pic:nvPicPr>
+                          <pic:cNvPr id="3" name="Image 3"/>
+                          <pic:cNvPicPr/>
+                        </pic:nvPicPr>
+                        <pic:blipFill>
+                          <a:blip r:embed="rId7" cstate="print"/>
+                          <a:stretch>
+                            <a:fillRect/>
+                          </a:stretch>
+                        </pic:blipFill>
+                        <pic:spPr>
+                          <a:xfrm>
+                            <a:off x="2185352" y="933450"/>
+                            <a:ext cx="1323799" cy="1323799"/>
+                          </a:xfrm>
+                          <a:prstGeom prst="rect">
+                            <a:avLst/>
+                          </a:prstGeom>
+                        </pic:spPr>
+                      </pic:pic>
+                      <wps:wsp>
+                        <wps:cNvPr id="4" name="Graphic 4"/>
+                        <wps:cNvSpPr/>
+                        <wps:spPr>
+                          <a:xfrm>
+                            <a:off x="2171065" y="8602345"/>
+                            <a:ext cx="1398905" cy="12700"/>
+                          </a:xfrm>
+                          <a:custGeom>
+                            <a:avLst/>
+                            <a:gdLst/>
+                            <a:ahLst/>
+                            <a:cxnLst/>
+                            <a:rect l="l" t="t" r="r" b="b"/>
+                            <a:pathLst>
+                              <a:path w="1398905" h="12700">
+                                <a:moveTo>
+                                  <a:pt x="1398904" y="12700"/>
+                                </a:moveTo>
+                                <a:lnTo>
+                                  <a:pt x="0" y="12700"/>
+                                </a:lnTo>
+                                <a:lnTo>
+                                  <a:pt x="0" y="0"/>
+                                </a:lnTo>
+                                <a:lnTo>
+                                  <a:pt x="1398904" y="0"/>
+                                </a:lnTo>
+                                <a:lnTo>
+                                  <a:pt x="1398904" y="12700"/>
+                                </a:lnTo>
+                                <a:close/>
+                              </a:path>
+                            </a:pathLst>
+                          </a:custGeom>
+                          <a:solidFill>
+                            <a:srgbClr val="000000"/>
+                          </a:solidFill>
+                        </wps:spPr>
+                        <wps:bodyPr wrap="square" lIns="0" tIns="0" rIns="0" bIns="0" rtlCol="0">
+                          <a:noAutofit/>
+                        </wps:bodyPr>
+                      </wps:wsp>
+                    </wpg:wgp>
+                  </a:graphicData>
+                </a:graphic>
+              </wp:anchor>
+            </w:drawing>
+          </mc:Choice>
+          <mc:Fallback>
+            <w:pict>
+              <v:group id="_x0000_s1026" o:spid="_x0000_s1026" o:spt="203" style="position:absolute;left:0pt;margin-left:80.5pt;margin-top:71.1pt;height:697.25pt;width:449pt;mso-position-horizontal-relative:page;mso-position-vertical-relative:page;z-index:-251657216;mso-width-relative:page;mso-height-relative:page;" coordsize="5702300,8855075" o:gfxdata="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">
+                <o:lock v:ext="edit" aspectratio="f"/>
+                <v:shape id="Graphic 2" o:spid="_x0000_s1026" o:spt="100" style="position:absolute;left:0;top:0;height:8855075;width:5702300;" fillcolor="#000000" filled="t" stroked="f" coordsize="5702300,8855075" o:gfxdata="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" path="m5662930,39370l39370,39370,39370,99060,39370,8756650,39370,8815070,5662930,8815070,5662930,8756650,98425,8756650,98425,99060,5603875,99060,5603875,8756332,5662930,8756332,5662930,99060,5662930,98742,5662930,39370xem5702300,0l0,0,0,20320,0,8835403,0,8854453,5702300,8854453,5702300,8835403,19685,8835403,19685,20320,5682615,20320,5682615,8835072,5702300,8835085,5702300,20320,5702300,20002,5702300,0xe">
+                  <v:fill on="t" focussize="0,0"/>
+                  <v:stroke on="f"/>
+                  <v:imagedata o:title=""/>
+                  <o:lock v:ext="edit" aspectratio="f"/>
+                  <v:textbox inset="0mm,0mm,0mm,0mm"/>
+                </v:shape>
+                <v:shape id="Image 3" o:spid="_x0000_s1026" o:spt="75" type="#_x0000_t75" style="position:absolute;left:2185352;top:933450;height:1323799;width:1323799;" filled="f" o:preferrelative="t" stroked="f" coordsize="21600,21600" o:gfxdata="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">
+                  <v:fill on="f" focussize="0,0"/>
+                  <v:stroke on="f"/>
+                  <v:imagedata r:id="rId7" o:title=""/>
+                  <o:lock v:ext="edit" aspectratio="f"/>
+                </v:shape>
+                <v:shape id="Graphic 4" o:spid="_x0000_s1026" o:spt="100" style="position:absolute;left:2171065;top:8602345;height:12700;width:1398905;" fillcolor="#000000" filled="t" stroked="f" coordsize="1398905,12700" o:gfxdata="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" path="m1398904,12700l0,12700,0,0,1398904,0,1398904,12700xe">
+                  <v:fill on="t" focussize="0,0"/>
+                  <v:stroke on="f"/>
+                  <v:imagedata o:title=""/>
+                  <o:lock v:ext="edit" aspectratio="f"/>
+                  <v:textbox inset="0mm,0mm,0mm,0mm"/>
+                </v:shape>
+              </v:group>
+            </w:pict>
+          </mc:Fallback>
+        </mc:AlternateContent>
+      </w:r>
+      <w:r>
+        <w:rPr>
+          <w:sz w:val="28"/>
+        </w:rPr>
+        <w:t>TRƯỜNG</w:t>
+      </w:r>
+      <w:r>
+        <w:rPr>
+          <w:spacing w:val="-5"/>
+          <w:sz w:val="28"/>
+        </w:rPr>
+        <w:t xml:space="preserve"> </w:t>
+      </w:r>
+      <w:r>
+        <w:rPr>
+          <w:sz w:val="28"/>
+        </w:rPr>
+        <w:t>ĐẠI</w:t>
+      </w:r>
+      <w:r>
+        <w:rPr>
+          <w:spacing w:val="-5"/>
+          <w:sz w:val="28"/>
+        </w:rPr>
+        <w:t xml:space="preserve"> </w:t>
+      </w:r>
+      <w:r>
+        <w:rPr>
+          <w:sz w:val="28"/>
+        </w:rPr>
+        <w:t>HỌC</w:t>
+      </w:r>
+      <w:r>
+        <w:rPr>
+          <w:spacing w:val="-5"/>
+          <w:sz w:val="28"/>
+        </w:rPr>
+        <w:t xml:space="preserve"> </w:t>
+      </w:r>
+      <w:r>
+        <w:rPr>
+          <w:sz w:val="28"/>
+        </w:rPr>
+        <w:t>CÔNG</w:t>
+      </w:r>
+      <w:r>
+        <w:rPr>
+          <w:spacing w:val="-7"/>
+          <w:sz w:val="28"/>
+        </w:rPr>
+        <w:t xml:space="preserve"> </w:t>
+      </w:r>
+      <w:r>
+        <w:rPr>
+          <w:sz w:val="28"/>
+        </w:rPr>
+        <w:t>NGHỆ</w:t>
+      </w:r>
+      <w:r>
+        <w:rPr>
+          <w:spacing w:val="-4"/>
+          <w:sz w:val="28"/>
+        </w:rPr>
+        <w:t xml:space="preserve"> </w:t>
+      </w:r>
+      <w:r>
+        <w:rPr>
+          <w:sz w:val="28"/>
+        </w:rPr>
+        <w:t>ĐÔNG</w:t>
+      </w:r>
+      <w:r>
+        <w:rPr>
+          <w:spacing w:val="-4"/>
+          <w:sz w:val="28"/>
+        </w:rPr>
+        <w:t xml:space="preserve"> </w:t>
+      </w:r>
+      <w:r>
+        <w:rPr>
+          <w:spacing w:val="-10"/>
+          <w:sz w:val="28"/>
+        </w:rPr>
+        <w:t>Á</w:t>
       </w:r>
     </w:p>
     <w:p>
@@ -33,11 +362,79 @@
       </w:pPr>
       <w:r>
         <w:rPr>
-          <w:rFonts w:ascii="Times New Roman" w:hAnsi="Times New Roman"/>
           <w:b/>
+          <w:bCs/>
           <w:sz w:val="28"/>
-        </w:rPr>
-        <w:t>KHOA CÔNG NGHỆ THÔNG TIN</w:t>
+          <w:szCs w:val="28"/>
+        </w:rPr>
+        <w:t>KHOA</w:t>
+      </w:r>
+      <w:r>
+        <w:rPr>
+          <w:b/>
+          <w:bCs/>
+          <w:spacing w:val="-12"/>
+          <w:sz w:val="28"/>
+          <w:szCs w:val="28"/>
+        </w:rPr>
+        <w:t xml:space="preserve"> </w:t>
+      </w:r>
+      <w:r>
+        <w:rPr>
+          <w:b/>
+          <w:bCs/>
+          <w:sz w:val="28"/>
+          <w:szCs w:val="28"/>
+        </w:rPr>
+        <w:t>CÔNG</w:t>
+      </w:r>
+      <w:r>
+        <w:rPr>
+          <w:b/>
+          <w:bCs/>
+          <w:spacing w:val="-5"/>
+          <w:sz w:val="28"/>
+          <w:szCs w:val="28"/>
+        </w:rPr>
+        <w:t xml:space="preserve"> </w:t>
+      </w:r>
+      <w:r>
+        <w:rPr>
+          <w:b/>
+          <w:bCs/>
+          <w:sz w:val="28"/>
+          <w:szCs w:val="28"/>
+        </w:rPr>
+        <w:t>NGHỆ</w:t>
+      </w:r>
+      <w:r>
+        <w:rPr>
+          <w:b/>
+          <w:bCs/>
+          <w:spacing w:val="-5"/>
+          <w:sz w:val="28"/>
+          <w:szCs w:val="28"/>
+        </w:rPr>
+        <w:t xml:space="preserve"> </w:t>
+      </w:r>
+      <w:r>
+        <w:rPr>
+          <w:b/>
+          <w:bCs/>
+          <w:sz w:val="28"/>
+          <w:szCs w:val="28"/>
+        </w:rPr>
+        <w:t>THÔNG</w:t>
+      </w:r>
+      <w:r>
+        <w:rPr>
+          <w:b/>
+          <w:bCs/>
+          <w:spacing w:val="-5"/>
+          <w:sz w:val="28"/>
+          <w:szCs w:val="28"/>
+        </w:rPr>
+        <w:t xml:space="preserve"> TIN</w:t>
       </w:r>
     </w:p>
     <w:p>
@@ -94,15 +491,30 @@
     <w:p>
       <w:pPr>
         <w:pStyle w:val="13"/>
-        <w:jc w:val="center"/>
-      </w:pPr>
-      <w:r>
-        <w:rPr>
-          <w:rFonts w:ascii="Times New Roman" w:hAnsi="Times New Roman"/>
-          <w:b/>
-          <w:sz w:val="48"/>
-        </w:rPr>
-        <w:t>BÀI TẬP LỚN</w:t>
+      </w:pPr>
+      <w:r>
+        <w:t>BÀI</w:t>
+      </w:r>
+      <w:r>
+        <w:rPr>
+          <w:spacing w:val="-1"/>
+        </w:rPr>
+        <w:t xml:space="preserve"> </w:t>
+      </w:r>
+      <w:r>
+        <w:t>TẬP</w:t>
+      </w:r>
+      <w:r>
+        <w:rPr>
+          <w:spacing w:val="-1"/>
+        </w:rPr>
+        <w:t xml:space="preserve"> </w:t>
+      </w:r>
+      <w:r>
+        <w:rPr>
+          <w:spacing w:val="-5"/>
+        </w:rPr>
+        <w:t>LỚN</w:t>
       </w:r>
     </w:p>
     <w:p>
@@ -131,11 +543,23 @@
       </w:pPr>
       <w:r>
         <w:rPr>
-          <w:rFonts w:ascii="Times New Roman" w:hAnsi="Times New Roman"/>
           <w:b/>
+          <w:bCs/>
           <w:sz w:val="32"/>
-        </w:rPr>
-        <w:t>HỌC PHẦN: CÔNG NGHỆ JAVA</w:t>
+          <w:szCs w:val="32"/>
+        </w:rPr>
+        <w:t xml:space="preserve">HỌC PHẦN: </w:t>
+      </w:r>
+      <w:r>
+        <w:rPr>
+          <w:rFonts w:hint="default"/>
+          <w:b/>
+          <w:bCs/>
+          <w:sz w:val="32"/>
+          <w:szCs w:val="32"/>
+          <w:lang w:val="vi-VN"/>
+        </w:rPr>
+        <w:t>CÔNG NGHỆ JAVA</w:t>
       </w:r>
     </w:p>
     <w:p>
@@ -152,11 +576,57 @@
       </w:pPr>
       <w:r>
         <w:rPr>
-          <w:rFonts w:ascii="Times New Roman" w:hAnsi="Times New Roman"/>
           <w:b/>
-          <w:sz w:val="30"/>
-        </w:rPr>
-        <w:t>ĐỀ TÀI: XÂY DỰNG ỨNG DỤNG WEB QUẢN LÝ SÀN THƯƠNG MẠI ĐIỆN TỬ ĐA NHÀ BÁN (MULTI-VENDOR MARKETPLACE) SỬ DỤNG SPRING BOOT, SPRING SECURITY, SPRING DATA JPA, THYMELEAF VÀ MYSQL</w:t>
+          <w:sz w:val="32"/>
+        </w:rPr>
+        <w:t>LỚP</w:t>
+      </w:r>
+      <w:r>
+        <w:rPr>
+          <w:b/>
+          <w:spacing w:val="-8"/>
+          <w:sz w:val="32"/>
+        </w:rPr>
+        <w:t xml:space="preserve"> </w:t>
+      </w:r>
+      <w:r>
+        <w:rPr>
+          <w:b/>
+          <w:sz w:val="32"/>
+        </w:rPr>
+        <w:t>TÍN</w:t>
+      </w:r>
+      <w:r>
+        <w:rPr>
+          <w:b/>
+          <w:spacing w:val="-5"/>
+          <w:sz w:val="32"/>
+        </w:rPr>
+        <w:t xml:space="preserve"> </w:t>
+      </w:r>
+      <w:r>
+        <w:rPr>
+          <w:b/>
+          <w:sz w:val="32"/>
+        </w:rPr>
+        <w:t>CHỈ:</w:t>
+      </w:r>
+      <w:r>
+        <w:rPr>
+          <w:b/>
+          <w:spacing w:val="-8"/>
+          <w:sz w:val="32"/>
+        </w:rPr>
+        <w:t xml:space="preserve"> </w:t>
+      </w:r>
+      <w:r>
+        <w:rPr>
+          <w:rFonts w:hint="default"/>
+          <w:b/>
+          <w:spacing w:val="-8"/>
+          <w:sz w:val="32"/>
+        </w:rPr>
+        <w:t>Công nghệ Java (N07)</w:t>
       </w:r>
     </w:p>
     <w:p>
@@ -171,12 +641,89 @@
       </w:pPr>
       <w:r>
         <w:rPr>
-          <w:rFonts w:ascii="Times New Roman" w:hAnsi="Times New Roman"/>
           <w:b/>
           <w:sz w:val="28"/>
         </w:rPr>
-        <w:t xml:space="preserve">Giảng viên hướng dẫn:  </w:t>
-        <w:br/>
+        <w:t>Giảng</w:t>
+      </w:r>
+      <w:r>
+        <w:rPr>
+          <w:b/>
+          <w:spacing w:val="-4"/>
+          <w:sz w:val="28"/>
+        </w:rPr>
+        <w:t xml:space="preserve"> </w:t>
+      </w:r>
+      <w:r>
+        <w:rPr>
+          <w:b/>
+          <w:sz w:val="28"/>
+        </w:rPr>
+        <w:t>viên</w:t>
+      </w:r>
+      <w:r>
+        <w:rPr>
+          <w:b/>
+          <w:spacing w:val="-5"/>
+          <w:sz w:val="28"/>
+        </w:rPr>
+        <w:t xml:space="preserve"> </w:t>
+      </w:r>
+      <w:r>
+        <w:rPr>
+          <w:b/>
+          <w:sz w:val="28"/>
+        </w:rPr>
+        <w:t>hướng</w:t>
+      </w:r>
+      <w:r>
+        <w:rPr>
+          <w:b/>
+          <w:spacing w:val="-4"/>
+          <w:sz w:val="28"/>
+        </w:rPr>
+        <w:t xml:space="preserve"> </w:t>
+      </w:r>
+      <w:r>
+        <w:rPr>
+          <w:b/>
+          <w:sz w:val="28"/>
+        </w:rPr>
+        <w:t>dẫn:</w:t>
+      </w:r>
+      <w:r>
+        <w:rPr>
+          <w:b/>
+          <w:spacing w:val="-5"/>
+          <w:sz w:val="28"/>
+        </w:rPr>
+        <w:t xml:space="preserve"> </w:t>
+      </w:r>
+      <w:r>
+        <w:rPr>
+          <w:rFonts w:hint="default"/>
+          <w:b/>
+          <w:spacing w:val="-5"/>
+          <w:sz w:val="28"/>
+          <w:lang w:val="vi-VN"/>
+        </w:rPr>
+        <w:t>Trần Xuân Thanh</w:t>
+      </w:r>
+      <w:r>
+        <w:rPr>
+          <w:rFonts w:hint="default"/>
+          <w:b/>
+          <w:spacing w:val="-5"/>
+          <w:sz w:val="28"/>
+          <w:lang w:val="vi-VN"/>
+        </w:rPr>
+        <w:br w:type="textWrapping"/>
+      </w:r>
+      <w:r>
+        <w:rPr>
+          <w:b/>
+          <w:sz w:val="28"/>
+        </w:rPr>
         <w:t xml:space="preserve"> Danh sách sinh viên thực hiện: Nhóm 7</w:t>
       </w:r>
     </w:p>
@@ -675,11 +1222,56 @@
       </w:pPr>
       <w:r>
         <w:rPr>
-          <w:rFonts w:ascii="Times New Roman" w:hAnsi="Times New Roman"/>
           <w:b/>
           <w:sz w:val="28"/>
         </w:rPr>
-        <w:t>Bắc Ninh - 2026</w:t>
+        <w:t>Bắc</w:t>
+      </w:r>
+      <w:r>
+        <w:rPr>
+          <w:b/>
+          <w:spacing w:val="-5"/>
+          <w:sz w:val="28"/>
+        </w:rPr>
+        <w:t xml:space="preserve"> </w:t>
+      </w:r>
+      <w:r>
+        <w:rPr>
+          <w:b/>
+          <w:sz w:val="28"/>
+        </w:rPr>
+        <w:t>Ninh</w:t>
+      </w:r>
+      <w:r>
+        <w:rPr>
+          <w:b/>
+          <w:spacing w:val="-5"/>
+          <w:sz w:val="28"/>
+        </w:rPr>
+        <w:t xml:space="preserve"> </w:t>
+      </w:r>
+      <w:r>
+        <w:rPr>
+          <w:b/>
+          <w:sz w:val="28"/>
+        </w:rPr>
+        <w:t>-</w:t>
+      </w:r>
+      <w:r>
+        <w:rPr>
+          <w:b/>
+          <w:spacing w:val="-2"/>
+          <w:sz w:val="28"/>
+        </w:rPr>
+        <w:t xml:space="preserve"> </w:t>
+      </w:r>
+      <w:r>
+        <w:rPr>
+          <w:b/>
+          <w:spacing w:val="-4"/>
+          <w:sz w:val="28"/>
+        </w:rPr>
+        <w:t>2026</w:t>
       </w:r>
     </w:p>
     <w:p>
@@ -7683,7 +8275,7 @@
           <w:rFonts w:ascii="Times New Roman" w:hAnsi="Times New Roman"/>
           <w:sz w:val="26"/>
         </w:rPr>
-        <w:t>Trong quá trình thực hiện đề tài, nhóm đã vận dụng sáng tạo các kiến thức đã học về lập trình Java nâng cao, kiến trúc MVC, bảo mật Spring Security và thiết kế CSDL MySQL. Nhóm xin chân thành cảm ơn sự hướng dẫn tận tình của các thầy cô bộ môn Công nghệ CNTT trường Đại học Công nghệ Đông Á đã định hướng giúp nhóm hoàn thành tốt bài tập lớn này.</w:t>
+        <w:t>Trong quá trình thực hiện đề tài, nhóm đã vận dụng sáng tạo các kiến thức đã học về lập trình Java nâng cao, kiến trúc MVC, bảo mật Spring Security và thiết kế CSDL MySQL. Nhóm xin chân thành cảm ơn sự hướng dẫn tận tình của thầy giáo Trần Xuân Thanh đã định hướng giúp nhóm hoàn thành tốt bài tập lớn này.</w:t>
       </w:r>
     </w:p>
     <w:p>

</xml_diff>

<commit_message>
docs: finalize 6-chapter report content matching exact requested outline while preserving cover page intact
</commit_message>
<xml_diff>
--- a/DeTaiCNJ_Nhom7.docx
+++ b/DeTaiCNJ_Nhom7.docx
@@ -8225,7 +8225,7 @@
     <w:p>
       <w:pPr>
         <w:pStyle w:val="2"/>
-        <w:spacing w:line="276" w:lineRule="auto" w:before="240" w:after="120"/>
+        <w:spacing w:line="276" w:lineRule="auto" w:before="280" w:after="120"/>
       </w:pPr>
       <w:r>
         <w:rPr>
@@ -8247,7 +8247,7 @@
           <w:rFonts w:ascii="Times New Roman" w:hAnsi="Times New Roman"/>
           <w:sz w:val="26"/>
         </w:rPr>
-        <w:t>Trong thời đại công nghệ thông tin phát triển mạnh mẽ như hiện nay, thương mại điện tử đa nhà bán (Multi-Vendor Marketplace) đã trở thành mô hình kinh doanh trực tuyến phát triển vượt bậc. Thay vì một cửa hàng đơn lẻ, sàn thương mại điện tử đa nhà bán cho phép nhiều nhà cung cấp (Vendors/Sellers) cùng đăng ký, mở gian hàng, đăng bán sản phẩm và quản lý đơn hàng độc lập trên cùng một nền tảng duy nhất.</w:t>
+        <w:t>Trong bối cảnh chuyển đổi số và sự phát triển bùng nổ của nền kinh tế số, thương mại điện tử (E-Commerce) đã trở thành một thành tố không thể thiếu trong hoạt động kinh doanh toàn cầu. Đặc biệt, mô hình Sàn thương mại điện tử đa nhà bán (Multi-Vendor Marketplace) mang lại môi trường kết nối linh hoạt giữa nhiều nhà cung cấp (Vendors/Sellers) và hàng triệu người tiêu dùng (Customers).</w:t>
       </w:r>
     </w:p>
     <w:p>
@@ -8261,7 +8261,7 @@
           <w:rFonts w:ascii="Times New Roman" w:hAnsi="Times New Roman"/>
           <w:sz w:val="26"/>
         </w:rPr>
-        <w:t>Xuất phát từ nhu cầu thực tiễn đó, nhóm 7 chúng em đã lựa chọn đề tài: “Xây dựng ứng dụng Web Quản lý Sàn Thương mại Điện tử Đa nhà bán (Multi-Vendor Marketplace)” ứng dụng hệ sinh thái Java Spring Boot, Spring Security, Spring Data JPA, Thymeleaf và hệ quản trị cơ sở dữ liệu MySQL 8. Mục tiêu của dự án là xây dựng hệ thống web thương mại điện tử hiện đại, phân quyền chặt chẽ giữa Quản trị viên (Admin), Nhà bán hàng (Vendor) và Khách hàng (Customer).</w:t>
+        <w:t>Nhận thức được tầm quan trọng thực tiễn và tính ứng dụng công nghệ cao của mô hình này, nhóm 7 chúng em đã thực hiện đề tài: “Xây dựng ứng dụng Web Quản lý Sàn Thương mại Điện tử Đa nhà bán (Multi-Vendor Marketplace)” ứng dụng ngôn ngữ Java 17, hệ sinh thái Spring Boot 3.1.5, Spring Security 6, Spring Data JPA, Hibernate 6, Thymeleaf 3 và hệ quản trị cơ sở dữ liệu MySQL 8.</w:t>
       </w:r>
     </w:p>
     <w:p>
@@ -8275,13 +8275,13 @@
           <w:rFonts w:ascii="Times New Roman" w:hAnsi="Times New Roman"/>
           <w:sz w:val="26"/>
         </w:rPr>
-        <w:t>Trong quá trình thực hiện đề tài, nhóm đã vận dụng sáng tạo các kiến thức đã học về lập trình Java nâng cao, kiến trúc MVC, bảo mật Spring Security và thiết kế CSDL MySQL. Nhóm xin chân thành cảm ơn sự hướng dẫn tận tình của thầy giáo Trần Xuân Thanh đã định hướng giúp nhóm hoàn thành tốt bài tập lớn này.</w:t>
+        <w:t>Báo cáo này trình bày toàn bộ quá trình nghiên cứu, phân tích thiết kế, xây dựng và kiểm thử hệ thống phần mềm web JVTech Marketplace. Nhóm xin chân thành cảm ơn thầy giáo Trần Xuân Thanh đã tận tình hướng dẫn và chỉ bảo trong suốt quá trình thực hiện bài tập lớn này.</w:t>
       </w:r>
     </w:p>
     <w:p>
       <w:pPr>
         <w:pStyle w:val="2"/>
-        <w:spacing w:line="276" w:lineRule="auto" w:before="240" w:after="120"/>
+        <w:spacing w:line="276" w:lineRule="auto" w:before="280" w:after="120"/>
       </w:pPr>
       <w:r>
         <w:rPr>
@@ -8305,23 +8305,29 @@
         </w:rPr>
         <w:t>Bảng 1: Danh sách thành viên thực hiện đề tài</w:t>
         <w:br/>
-        <w:t>Bảng 2: Danh mục từ viết tắt</w:t>
+        <w:t>Bảng 2: Danh mục các từ viết tắt</w:t>
         <w:br/>
-        <w:t>Bảng 3: Cấu trúc các bảng dữ liệu trong CSDL tmdd_db</w:t>
+        <w:t>Bảng 3: Chi tiết các bảng dữ liệu trong CSDL tmdd_db</w:t>
         <w:br/>
-        <w:t>Hình 1: Sơ đồ kiến trúc tổng quan hệ thống Spring Boot Multi-Vendor</w:t>
+        <w:t>Bảng 4: Kịch bản kiểm thử các chức năng chính</w:t>
+        <w:br/>
+        <w:t>Hình 1: Mô hình kiến trúc hệ thống tổng quan (Spring Boot MVC)</w:t>
         <w:br/>
         <w:t>Hình 2: Sơ đồ Use Case phân quyền Admin, Vendor, Customer</w:t>
         <w:br/>
-        <w:t>Hình 3: Giao diện Trang chủ và Chi tiết sản phẩm JVTech Marketplace</w:t>
+        <w:t>Hình 3: Sơ đồ Activity quá trình Đặt hàng và Tách đơn hàng</w:t>
         <w:br/>
-        <w:t>Hình 4: Sơ đồ Entity Relationship Diagram (ERD) 8 bảng dữ liệu</w:t>
+        <w:t>Hình 4: Sơ đồ Sequence luồng Xử lý Đăng nhập và Phân quyền</w:t>
+        <w:br/>
+        <w:t>Hình 5: Sơ đồ Class Diagram các Entity chính</w:t>
+        <w:br/>
+        <w:t>Hình 6: Mô hình Quan hệ Dữ liệu (ERD) 8 bảng</w:t>
       </w:r>
     </w:p>
     <w:p>
       <w:pPr>
         <w:pStyle w:val="2"/>
-        <w:spacing w:line="276" w:lineRule="auto" w:before="240" w:after="120"/>
+        <w:spacing w:line="276" w:lineRule="auto" w:before="280" w:after="120"/>
       </w:pPr>
       <w:r>
         <w:rPr>
@@ -8329,13 +8335,13 @@
           <w:b/>
           <w:sz w:val="32"/>
         </w:rPr>
-        <w:t>CHƯƠNG 1: TỔNG QUAN VỀ DỰ ÁN VÀ SÀN THƯƠNG MẠI ĐIỆN TỬ ĐA NHÀ BÁN</w:t>
+        <w:t>CHƯƠNG 1. TỔNG QUAN ĐỀ TÀI</w:t>
       </w:r>
     </w:p>
     <w:p>
       <w:pPr>
         <w:pStyle w:val="3"/>
-        <w:spacing w:line="276" w:lineRule="auto" w:before="180" w:after="80"/>
+        <w:spacing w:line="276" w:lineRule="auto" w:before="200" w:after="80"/>
       </w:pPr>
       <w:r>
         <w:rPr>
@@ -8357,13 +8363,13 @@
           <w:rFonts w:ascii="Times New Roman" w:hAnsi="Times New Roman"/>
           <w:sz w:val="26"/>
         </w:rPr>
-        <w:t>Mô hình Multi-Vendor Marketplace (như Shopee, Lazada, Amazon) mang lại giá trị kinh tế lớn và khả năng mở rộng không giới hạn. Việc xây dựng một sàn thương mại điện tử đa nhà bán bằng Spring Boot giúp sinh viên làm chủ kiến trúc doanh nghiệp (Enterprise Java Framework), nắm vững cơ chế phân quyền RBAC và xử lý các bài toán nghiệp vụ phức tạp như tách đơn hàng theo nhà bán.</w:t>
+        <w:t>Thương mại điện tử đa nhà bán là mô hình kinh doanh có tốc độ tăng trưởng nhanh nhất trong ngành bán lẻ trực tuyến. Khác với website bán hàng đơn lẻ (Single-vendor), sàn thương mại điện tử cho phép mở rộng quy mô sản phẩm không giới hạn nhờ sự tham gia của nhiều đối tác gian hàng. Việc xây dựng ứng dụng Web Multi-Vendor Marketplace đòi hỏi giải quyết các bài toán kỹ thuật phức tạp như phân quyền đa cấp (RBAC), quản lý giỏ hàng đa gian hàng và tách đơn hàng tự động (Order Splitting). Đề tài giúp sinh viên củng cố kiến thức lập trình Java Enterprise và làm chủ các công nghệ cốt lõi trong thực tế.</w:t>
       </w:r>
     </w:p>
     <w:p>
       <w:pPr>
         <w:pStyle w:val="3"/>
-        <w:spacing w:line="276" w:lineRule="auto" w:before="180" w:after="80"/>
+        <w:spacing w:line="276" w:lineRule="auto" w:before="200" w:after="80"/>
       </w:pPr>
       <w:r>
         <w:rPr>
@@ -8385,7 +8391,7 @@
           <w:rFonts w:ascii="Times New Roman" w:hAnsi="Times New Roman"/>
           <w:sz w:val="26"/>
         </w:rPr>
-        <w:t>• Xây dựng hoàn chỉnh hệ thống Web E-Commerce Đa nhà bán sử dụng Spring Boot 3.1.5 và MySQL 8.</w:t>
+        <w:t>• Xây dựng hệ thống Web thương mại điện tử đa nhà bán hoàn chỉnh, chạy mượt mà trên môi trường thực tế.</w:t>
       </w:r>
     </w:p>
     <w:p>
@@ -8399,7 +8405,7 @@
           <w:rFonts w:ascii="Times New Roman" w:hAnsi="Times New Roman"/>
           <w:sz w:val="26"/>
         </w:rPr>
-        <w:t>• Thiết lập cơ chế bảo mật và phân quyền 3 cấp độ: Admin (Quản trị sàn), Vendor (Chủ gian hàng), Customer (Khách mua hàng).</w:t>
+        <w:t>• Thiết lập cơ chế bảo mật và phân quyền 3 vai trò: Admin (Quản trị hệ thống), Vendor (Chủ gian hàng), Customer (Khách hàng).</w:t>
       </w:r>
     </w:p>
     <w:p>
@@ -8413,7 +8419,7 @@
           <w:rFonts w:ascii="Times New Roman" w:hAnsi="Times New Roman"/>
           <w:sz w:val="26"/>
         </w:rPr>
-        <w:t>• Hiện thực hóa nghiệp vụ Giỏ hàng, Đặt hàng và Tách đơn hàng tự động (Order Splitting per Vendor).</w:t>
+        <w:t>• Xây dựng quy trình xử lý đơn hàng phức tạp: Đặt hàng chung và tự động phân tách thành các đơn hàng con theo gian hàng (Shop).</w:t>
       </w:r>
     </w:p>
     <w:p>
@@ -8427,13 +8433,13 @@
           <w:rFonts w:ascii="Times New Roman" w:hAnsi="Times New Roman"/>
           <w:sz w:val="26"/>
         </w:rPr>
-        <w:t>• Xây dựng giao diện responsive thân thiện với Thymeleaf và Bootstrap 5.</w:t>
+        <w:t>• Thiết kế giao diện người dùng responsive, hiện đại bằng Thymeleaf 3, HTML5, CSS3 và JavaScript.</w:t>
       </w:r>
     </w:p>
     <w:p>
       <w:pPr>
         <w:pStyle w:val="3"/>
-        <w:spacing w:line="276" w:lineRule="auto" w:before="180" w:after="80"/>
+        <w:spacing w:line="276" w:lineRule="auto" w:before="200" w:after="80"/>
       </w:pPr>
       <w:r>
         <w:rPr>
@@ -8455,27 +8461,15 @@
           <w:rFonts w:ascii="Times New Roman" w:hAnsi="Times New Roman"/>
           <w:sz w:val="26"/>
         </w:rPr>
-        <w:t>Đối tượng nghiên cứu bao gồm hệ sinh thái Spring Framework (Spring Boot, Spring Security, Spring Data JPA, Thymeleaf), HQTCSDL MySQL và kiến trúc phần mềm MVC. Phạm vi dự án tập trung vào quản lý người dùng, cửa hàng, sản phẩm, giỏ hàng, đặt hàng, tách đơn hàng và đánh giá sản phẩm.</w:t>
-      </w:r>
-    </w:p>
-    <w:p>
-      <w:pPr>
-        <w:pStyle w:val="2"/>
-        <w:spacing w:line="276" w:lineRule="auto" w:before="240" w:after="120"/>
-      </w:pPr>
-      <w:r>
-        <w:rPr>
-          <w:rFonts w:ascii="Times New Roman" w:hAnsi="Times New Roman"/>
-          <w:b/>
-          <w:sz w:val="32"/>
-        </w:rPr>
-        <w:t>CHƯƠNG 2: CƠ SỞ LÝ THUYẾT VÀ CÔNG NGHỆ SỬ DỤNG</w:t>
+        <w:t>Đối tượng nghiên cứu: Hệ sinh thái Spring Framework (Spring Boot 3, Spring Security 6, Spring Data JPA), Template Engine Thymeleaf, HQTCSDL MySQL 8 và kiến trúc thiết kế phần mềm MVC.</w:t>
+        <w:br/>
+        <w:t>Phạm vi nghiên cứu: Tập trung vào quy trình nghiệp vụ sàn thương mại điện tử bao gồm đăng ký/đăng nhập, duyệt nhà bán, đăng sản phẩm, tìm kiếm/lọc, giỏ hàng, đặt hàng, tách đơn hàng, theo dõi trạng thái đơn và đánh giá sản phẩm.</w:t>
       </w:r>
     </w:p>
     <w:p>
       <w:pPr>
         <w:pStyle w:val="3"/>
-        <w:spacing w:line="276" w:lineRule="auto" w:before="180" w:after="80"/>
+        <w:spacing w:line="276" w:lineRule="auto" w:before="200" w:after="80"/>
       </w:pPr>
       <w:r>
         <w:rPr>
@@ -8483,7 +8477,7 @@
           <w:b/>
           <w:sz w:val="28"/>
         </w:rPr>
-        <w:t>2.1. Ngôn ngữ Java 17 LTS</w:t>
+        <w:t>1.4. Phương pháp thực hiện</w:t>
       </w:r>
     </w:p>
     <w:p>
@@ -8497,13 +8491,17 @@
           <w:rFonts w:ascii="Times New Roman" w:hAnsi="Times New Roman"/>
           <w:sz w:val="26"/>
         </w:rPr>
-        <w:t>Java 17 LTS là phiên bản hỗ trợ dài hạn của Oracle cung cấp hiệu năng vượt trội, tính năng Pattern Matching, Records, Sealed Classes và tối ưu hóa quản lý bộ nhớ GC.</w:t>
+        <w:t>• Phương pháp nghiên cứu lý thuyết: Tìm hiểu tài liệu chính thức của Spring Boot, Spring Security, Hibernate và MySQL.</w:t>
+        <w:br/>
+        <w:t>• Phương pháp phân tích thiết kế: Phân tích yêu cầu chức năng/phi chức năng, vẽ sơ đồ UML (Use Case, Activity, Sequence, Class Diagram, ERD).</w:t>
+        <w:br/>
+        <w:t>• Phương pháp lập trình thực nghiệm: Phát triển mã nguồn Java theo chuẩn phân lớp MVC, xây dựng CSDL MySQL và kiểm thử hệ thống.</w:t>
       </w:r>
     </w:p>
     <w:p>
       <w:pPr>
         <w:pStyle w:val="3"/>
-        <w:spacing w:line="276" w:lineRule="auto" w:before="180" w:after="80"/>
+        <w:spacing w:line="276" w:lineRule="auto" w:before="200" w:after="80"/>
       </w:pPr>
       <w:r>
         <w:rPr>
@@ -8511,7 +8509,7 @@
           <w:b/>
           <w:sz w:val="28"/>
         </w:rPr>
-        <w:t>2.2. Framework Spring Boot 3.1.5</w:t>
+        <w:t>1.5. Ý nghĩa của đề tài</w:t>
       </w:r>
     </w:p>
     <w:p>
@@ -8525,13 +8523,15 @@
           <w:rFonts w:ascii="Times New Roman" w:hAnsi="Times New Roman"/>
           <w:sz w:val="26"/>
         </w:rPr>
-        <w:t>Spring Boot đơn giản hóa quá trình phát triển ứng dụng Java Enterprise nhờ tính năng Auto-configuration, nhúng sẵn Tomcat Server và hệ thống Spring Initializr giúp khởi tạo ứng dụng nhanh chóng.</w:t>
+        <w:t>• Ý nghĩa khoa học và học thuật: Giúp sinh viên nắm vững phương pháp thiết kế và phát triển ứng dụng Java Web quy mô Enterprise.</w:t>
+        <w:br/>
+        <w:t>• Ý nghĩa thực tiễn: Cung cấp giải pháp nền tảng sàn thương mại điện tử đa nhà bán có tính ứng dụng cao, sẵn sàng đưa vào vận hành thực tế.</w:t>
       </w:r>
     </w:p>
     <w:p>
       <w:pPr>
         <w:pStyle w:val="3"/>
-        <w:spacing w:line="276" w:lineRule="auto" w:before="180" w:after="80"/>
+        <w:spacing w:line="276" w:lineRule="auto" w:before="200" w:after="80"/>
       </w:pPr>
       <w:r>
         <w:rPr>
@@ -8539,7 +8539,7 @@
           <w:b/>
           <w:sz w:val="28"/>
         </w:rPr>
-        <w:t>2.3. Spring Security 6 và Phân quyền</w:t>
+        <w:t>1.6. Bố cục báo cáo</w:t>
       </w:r>
     </w:p>
     <w:p>
@@ -8553,13 +8553,39 @@
           <w:rFonts w:ascii="Times New Roman" w:hAnsi="Times New Roman"/>
           <w:sz w:val="26"/>
         </w:rPr>
-        <w:t>Spring Security 6 cung cấp giải pháp xác thực (Authentication) và phân quyền (Authorization) mạnh mẽ. Hệ thống sử dụng CustomUserDetailsService để tải thông tin tài khoản từ CSDL và CustomAuthSuccessHandler để điều hướng người dùng sau khi đăng nhập thành công dựa trên Role (ROLE_ADMIN -&gt; /admin, ROLE_VENDOR -&gt; /vendor, ROLE_CUSTOMER -&gt; /).</w:t>
+        <w:t>Báo cáo được cấu trúc thành 6 chương chính:</w:t>
+        <w:br/>
+        <w:t>- Chương 1: Tổng quan đề tài</w:t>
+        <w:br/>
+        <w:t>- Chương 2: Cơ sở lý thuyết</w:t>
+        <w:br/>
+        <w:t>- Chương 3: Phân tích và thiết kế hệ thống</w:t>
+        <w:br/>
+        <w:t>- Chương 4: Xây dựng hệ thống</w:t>
+        <w:br/>
+        <w:t>- Chương 5: Kiểm thử và đánh giá</w:t>
+        <w:br/>
+        <w:t>- Chương 6: Kết luận và hướng phát triển</w:t>
+      </w:r>
+    </w:p>
+    <w:p>
+      <w:pPr>
+        <w:pStyle w:val="2"/>
+        <w:spacing w:line="276" w:lineRule="auto" w:before="280" w:after="120"/>
+      </w:pPr>
+      <w:r>
+        <w:rPr>
+          <w:rFonts w:ascii="Times New Roman" w:hAnsi="Times New Roman"/>
+          <w:b/>
+          <w:sz w:val="32"/>
+        </w:rPr>
+        <w:t>CHƯƠNG 2. CƠ SỞ LÝ THUYẾT</w:t>
       </w:r>
     </w:p>
     <w:p>
       <w:pPr>
         <w:pStyle w:val="3"/>
-        <w:spacing w:line="276" w:lineRule="auto" w:before="180" w:after="80"/>
+        <w:spacing w:line="276" w:lineRule="auto" w:before="200" w:after="80"/>
       </w:pPr>
       <w:r>
         <w:rPr>
@@ -8567,7 +8593,7 @@
           <w:b/>
           <w:sz w:val="28"/>
         </w:rPr>
-        <w:t>2.4. Spring Data JPA và Hibernate 6</w:t>
+        <w:t>2.1. Tổng quan thương mại điện tử</w:t>
       </w:r>
     </w:p>
     <w:p>
@@ -8581,13 +8607,13 @@
           <w:rFonts w:ascii="Times New Roman" w:hAnsi="Times New Roman"/>
           <w:sz w:val="26"/>
         </w:rPr>
-        <w:t>Spring Data JPA tự động tạo các câu lệnh SQL CRUD thông qua việc kế thừa JpaRepository. Hibernate đóng vai trò là ORM provider ánh xạ các lớp Entity (User, Shop, Product, Order, OrderItem, Review) sang các bảng trong CSDL MySQL.</w:t>
+        <w:t>Thương mại điện tử (E-Commerce) là việc mua bán hàng hóa và dịch vụ thông qua mạng Internet. Các hình thức phổ biến bao gồm B2C (Business-to-Consumer), B2B (Business-to-Business) và C2C (Consumer-to-Consumer).</w:t>
       </w:r>
     </w:p>
     <w:p>
       <w:pPr>
         <w:pStyle w:val="3"/>
-        <w:spacing w:line="276" w:lineRule="auto" w:before="180" w:after="80"/>
+        <w:spacing w:line="276" w:lineRule="auto" w:before="200" w:after="80"/>
       </w:pPr>
       <w:r>
         <w:rPr>
@@ -8595,7 +8621,7 @@
           <w:b/>
           <w:sz w:val="28"/>
         </w:rPr>
-        <w:t>2.5. Template Engine Thymeleaf 3</w:t>
+        <w:t>2.2. Mô hình Multi-Vendor Marketplace</w:t>
       </w:r>
     </w:p>
     <w:p>
@@ -8609,13 +8635,13 @@
           <w:rFonts w:ascii="Times New Roman" w:hAnsi="Times New Roman"/>
           <w:sz w:val="26"/>
         </w:rPr>
-        <w:t>Thymeleaf là template engine hiện đại hỗ trợ Natural Templates, giúp làm việc trực tiếp với HTML5 mà không làm phá hỏng cấu trúc giao diện. Tích hợp thymeleaf-extras-springsecurity6 cho phép hiển thị menu linh hoạt theo Role.</w:t>
+        <w:t>Mô hình Multi-Vendor Marketplace đóng vai trò là sàn giao dịch trung gian kết nối Người bán (Vendor) và Người mua (Customer). Ban quản trị (Admin) kiểm soát toàn bộ chính sách sàn, danh mục sản phẩm và hoa hồng giao dịch.</w:t>
       </w:r>
     </w:p>
     <w:p>
       <w:pPr>
         <w:pStyle w:val="3"/>
-        <w:spacing w:line="276" w:lineRule="auto" w:before="180" w:after="80"/>
+        <w:spacing w:line="276" w:lineRule="auto" w:before="200" w:after="80"/>
       </w:pPr>
       <w:r>
         <w:rPr>
@@ -8623,7 +8649,7 @@
           <w:b/>
           <w:sz w:val="28"/>
         </w:rPr>
-        <w:t>2.6. Cơ sở dữ liệu MySQL 8</w:t>
+        <w:t>2.3. Java và Spring Boot</w:t>
       </w:r>
     </w:p>
     <w:p>
@@ -8637,13 +8663,13 @@
           <w:rFonts w:ascii="Times New Roman" w:hAnsi="Times New Roman"/>
           <w:sz w:val="26"/>
         </w:rPr>
-        <w:t>MySQL 8 là hệ quản trị cơ sở dữ liệu quan hệ mạnh mẽ, hỗ trợ ACID, khoá ngoại Foreign Key và Index giúp tối ưu truy vấn dữ liệu thương mại điện tử.</w:t>
+        <w:t>Java 17 LTS cung cấp hiệu năng vượt trội và tính ổn định cao. Spring Boot 3.1.5 hỗ trợ khởi tạo dự án nhanh chóng nhờ các Starter dependency, tự động cấu hình (Auto-configuration) và nhúng sẵn Tomcat Web Server.</w:t>
       </w:r>
     </w:p>
     <w:p>
       <w:pPr>
         <w:pStyle w:val="3"/>
-        <w:spacing w:line="276" w:lineRule="auto" w:before="180" w:after="80"/>
+        <w:spacing w:line="276" w:lineRule="auto" w:before="200" w:after="80"/>
       </w:pPr>
       <w:r>
         <w:rPr>
@@ -8651,7 +8677,7 @@
           <w:b/>
           <w:sz w:val="28"/>
         </w:rPr>
-        <w:t>2.7. Mô hình kiến trúc MVC</w:t>
+        <w:t>2.4. Spring Security</w:t>
       </w:r>
     </w:p>
     <w:p>
@@ -8665,27 +8691,13 @@
           <w:rFonts w:ascii="Times New Roman" w:hAnsi="Times New Roman"/>
           <w:sz w:val="26"/>
         </w:rPr>
-        <w:t>Mô hình MVC tách biệt rõ ràng 3 lớp: Model (Entities &amp; DTOs), View (Thymeleaf Templates), Controller (Spring MVC Controllers), đảm bảo mã nguồn dễ bảo trì và mở rộng.</w:t>
-      </w:r>
-    </w:p>
-    <w:p>
-      <w:pPr>
-        <w:pStyle w:val="2"/>
-        <w:spacing w:line="276" w:lineRule="auto" w:before="240" w:after="120"/>
-      </w:pPr>
-      <w:r>
-        <w:rPr>
-          <w:rFonts w:ascii="Times New Roman" w:hAnsi="Times New Roman"/>
-          <w:b/>
-          <w:sz w:val="32"/>
-        </w:rPr>
-        <w:t>CHƯƠNG 3: PHÂN TÍCH VÀ THIẾT KẾ HỆ THỐNG</w:t>
+        <w:t>Spring Security 6 cung cấp cơ chế bảo mật mạnh mẽ, mã hóa mật khẩu bằng BCrypt, ngăn chặn tấn công CSRF/XSS và phân quyền chi tiết dựa trên Role (ROLE_ADMIN, ROLE_VENDOR, ROLE_CUSTOMER).</w:t>
       </w:r>
     </w:p>
     <w:p>
       <w:pPr>
         <w:pStyle w:val="3"/>
-        <w:spacing w:line="276" w:lineRule="auto" w:before="180" w:after="80"/>
+        <w:spacing w:line="276" w:lineRule="auto" w:before="200" w:after="80"/>
       </w:pPr>
       <w:r>
         <w:rPr>
@@ -8693,7 +8705,7 @@
           <w:b/>
           <w:sz w:val="28"/>
         </w:rPr>
-        <w:t>3.1. Khảo sát yêu cầu bài toán</w:t>
+        <w:t>2.5. Spring Data JPA / Hibernate</w:t>
       </w:r>
     </w:p>
     <w:p>
@@ -8707,13 +8719,13 @@
           <w:rFonts w:ascii="Times New Roman" w:hAnsi="Times New Roman"/>
           <w:sz w:val="26"/>
         </w:rPr>
-        <w:t>Hệ thống cần đáp ứng nhu cầu kinh doanh của 3 tác nhân chính: Admin quản trị hệ thống, Vendor bán hàng và Customer mua sắm.</w:t>
+        <w:t>Spring Data JPA đơng giản hóa tầng truy xuất dữ liệu DAO thông qua kế thừa JpaRepository. Hibernate 6 đóng vai trò ORM Provider ánh xạ các lớp Entity đối tượng sang các bảng trong MySQL Database.</w:t>
       </w:r>
     </w:p>
     <w:p>
       <w:pPr>
         <w:pStyle w:val="3"/>
-        <w:spacing w:line="276" w:lineRule="auto" w:before="180" w:after="80"/>
+        <w:spacing w:line="276" w:lineRule="auto" w:before="200" w:after="80"/>
       </w:pPr>
       <w:r>
         <w:rPr>
@@ -8721,7 +8733,259 @@
           <w:b/>
           <w:sz w:val="28"/>
         </w:rPr>
-        <w:t>3.2. Phân tích các tác nhân</w:t>
+        <w:t>2.6. Thymeleaf</w:t>
+      </w:r>
+    </w:p>
+    <w:p>
+      <w:pPr>
+        <w:pStyle w:val="8"/>
+        <w:spacing w:line="276" w:lineRule="auto" w:before="0" w:after="60"/>
+        <w:jc w:val="both"/>
+      </w:pPr>
+      <w:r>
+        <w:rPr>
+          <w:rFonts w:ascii="Times New Roman" w:hAnsi="Times New Roman"/>
+          <w:sz w:val="26"/>
+        </w:rPr>
+        <w:t>Thymeleaf 3 là Template Engine phía Server dành cho Java Web. Tính năng Natural Templates cho phép các file HTML hiển thị chính xác cả khi xem ngoại tuyến lẫn khi được render bởi Server.</w:t>
+      </w:r>
+    </w:p>
+    <w:p>
+      <w:pPr>
+        <w:pStyle w:val="3"/>
+        <w:spacing w:line="276" w:lineRule="auto" w:before="200" w:after="80"/>
+      </w:pPr>
+      <w:r>
+        <w:rPr>
+          <w:rFonts w:ascii="Times New Roman" w:hAnsi="Times New Roman"/>
+          <w:b/>
+          <w:sz w:val="28"/>
+        </w:rPr>
+        <w:t>2.7. MySQL</w:t>
+      </w:r>
+    </w:p>
+    <w:p>
+      <w:pPr>
+        <w:pStyle w:val="8"/>
+        <w:spacing w:line="276" w:lineRule="auto" w:before="0" w:after="60"/>
+        <w:jc w:val="both"/>
+      </w:pPr>
+      <w:r>
+        <w:rPr>
+          <w:rFonts w:ascii="Times New Roman" w:hAnsi="Times New Roman"/>
+          <w:sz w:val="26"/>
+        </w:rPr>
+        <w:t>MySQL 8 là hệ quản trị CSDL quan hệ tốc độ cao, hỗ trợ chuẩn giao dịch ACID và toàn vẹn dữ liệu qua các ràng buộc khóa ngoại (Foreign Keys).</w:t>
+      </w:r>
+    </w:p>
+    <w:p>
+      <w:pPr>
+        <w:pStyle w:val="3"/>
+        <w:spacing w:line="276" w:lineRule="auto" w:before="200" w:after="80"/>
+      </w:pPr>
+      <w:r>
+        <w:rPr>
+          <w:rFonts w:ascii="Times New Roman" w:hAnsi="Times New Roman"/>
+          <w:b/>
+          <w:sz w:val="28"/>
+        </w:rPr>
+        <w:t>2.8. Mô hình MVC</w:t>
+      </w:r>
+    </w:p>
+    <w:p>
+      <w:pPr>
+        <w:pStyle w:val="8"/>
+        <w:spacing w:line="276" w:lineRule="auto" w:before="0" w:after="60"/>
+        <w:jc w:val="both"/>
+      </w:pPr>
+      <w:r>
+        <w:rPr>
+          <w:rFonts w:ascii="Times New Roman" w:hAnsi="Times New Roman"/>
+          <w:sz w:val="26"/>
+        </w:rPr>
+        <w:t>Mô hình MVC (Model - View - Controller) phân tách mã nguồn thành 3 lớp riêng biệt: Model chứa Entity/DTO, View chứa giao diện Thymeleaf, Controller xử lý HTTP Request và điều hướng.</w:t>
+      </w:r>
+    </w:p>
+    <w:p>
+      <w:pPr>
+        <w:pStyle w:val="3"/>
+        <w:spacing w:line="276" w:lineRule="auto" w:before="200" w:after="80"/>
+      </w:pPr>
+      <w:r>
+        <w:rPr>
+          <w:rFonts w:ascii="Times New Roman" w:hAnsi="Times New Roman"/>
+          <w:b/>
+          <w:sz w:val="28"/>
+        </w:rPr>
+        <w:t>2.9. Kiến trúc hệ thống</w:t>
+      </w:r>
+    </w:p>
+    <w:p>
+      <w:pPr>
+        <w:pStyle w:val="8"/>
+        <w:spacing w:line="276" w:lineRule="auto" w:before="0" w:after="60"/>
+        <w:jc w:val="both"/>
+      </w:pPr>
+      <w:r>
+        <w:rPr>
+          <w:rFonts w:ascii="Times New Roman" w:hAnsi="Times New Roman"/>
+          <w:sz w:val="26"/>
+        </w:rPr>
+        <w:t>Hệ thống xây dựng theo kiến trúc phân lớp chuẩn Enterprise: Controller Layer -&gt; Service Layer -&gt; Repository Layer -&gt; Database Layer.</w:t>
+      </w:r>
+    </w:p>
+    <w:p>
+      <w:pPr>
+        <w:pStyle w:val="2"/>
+        <w:spacing w:line="276" w:lineRule="auto" w:before="280" w:after="120"/>
+      </w:pPr>
+      <w:r>
+        <w:rPr>
+          <w:rFonts w:ascii="Times New Roman" w:hAnsi="Times New Roman"/>
+          <w:b/>
+          <w:sz w:val="32"/>
+        </w:rPr>
+        <w:t>CHƯƠNG 3. PHÂN TÍCH VÀ THIẾT KẾ HỆ THỐNG</w:t>
+      </w:r>
+    </w:p>
+    <w:p>
+      <w:pPr>
+        <w:pStyle w:val="3"/>
+        <w:spacing w:line="276" w:lineRule="auto" w:before="200" w:after="80"/>
+      </w:pPr>
+      <w:r>
+        <w:rPr>
+          <w:rFonts w:ascii="Times New Roman" w:hAnsi="Times New Roman"/>
+          <w:b/>
+          <w:sz w:val="28"/>
+        </w:rPr>
+        <w:t>3.1. Khảo sát yêu cầu</w:t>
+      </w:r>
+    </w:p>
+    <w:p>
+      <w:pPr>
+        <w:pStyle w:val="8"/>
+        <w:spacing w:line="276" w:lineRule="auto" w:before="0" w:after="60"/>
+        <w:jc w:val="both"/>
+      </w:pPr>
+      <w:r>
+        <w:rPr>
+          <w:rFonts w:ascii="Times New Roman" w:hAnsi="Times New Roman"/>
+          <w:sz w:val="26"/>
+        </w:rPr>
+        <w:t>Khảo sát thực tế nhu cầu người dùng cho thấy hệ thống cần đảm bảo tính tiện lợi khi mua sắm, minh bạch cho nhà bán hàng và khả năng quản lý toàn diện cho ban quản trị.</w:t>
+      </w:r>
+    </w:p>
+    <w:p>
+      <w:pPr>
+        <w:pStyle w:val="3"/>
+        <w:spacing w:line="276" w:lineRule="auto" w:before="200" w:after="80"/>
+      </w:pPr>
+      <w:r>
+        <w:rPr>
+          <w:rFonts w:ascii="Times New Roman" w:hAnsi="Times New Roman"/>
+          <w:b/>
+          <w:sz w:val="28"/>
+        </w:rPr>
+        <w:t>3.2. Phân tích tác nhân</w:t>
+      </w:r>
+    </w:p>
+    <w:p>
+      <w:pPr>
+        <w:pStyle w:val="4"/>
+        <w:spacing w:line="276" w:lineRule="auto" w:before="140" w:after="60"/>
+      </w:pPr>
+      <w:r>
+        <w:rPr>
+          <w:rFonts w:ascii="Times New Roman" w:hAnsi="Times New Roman"/>
+          <w:b/>
+          <w:sz w:val="26"/>
+        </w:rPr>
+        <w:t>Admin (Quản trị viên sàn)</w:t>
+      </w:r>
+    </w:p>
+    <w:p>
+      <w:pPr>
+        <w:pStyle w:val="8"/>
+        <w:spacing w:line="276" w:lineRule="auto" w:before="0" w:after="60"/>
+        <w:jc w:val="both"/>
+      </w:pPr>
+      <w:r>
+        <w:rPr>
+          <w:rFonts w:ascii="Times New Roman" w:hAnsi="Times New Roman"/>
+          <w:sz w:val="26"/>
+        </w:rPr>
+        <w:t>Admin có quyền hạn cao nhất: quản lý tài khoản người dùng, duyệt/khóa nhà bán hàng, quản lý danh mục sản phẩm, quản lý tất cả đơn hàng, cấu hình trang web và xem thống kê tổng quan sàn.</w:t>
+      </w:r>
+    </w:p>
+    <w:p>
+      <w:pPr>
+        <w:pStyle w:val="4"/>
+        <w:spacing w:line="276" w:lineRule="auto" w:before="140" w:after="60"/>
+      </w:pPr>
+      <w:r>
+        <w:rPr>
+          <w:rFonts w:ascii="Times New Roman" w:hAnsi="Times New Roman"/>
+          <w:b/>
+          <w:sz w:val="26"/>
+        </w:rPr>
+        <w:t>Seller / Nhà bán hàng (Vendor)</w:t>
+      </w:r>
+    </w:p>
+    <w:p>
+      <w:pPr>
+        <w:pStyle w:val="8"/>
+        <w:spacing w:line="276" w:lineRule="auto" w:before="0" w:after="60"/>
+        <w:jc w:val="both"/>
+      </w:pPr>
+      <w:r>
+        <w:rPr>
+          <w:rFonts w:ascii="Times New Roman" w:hAnsi="Times New Roman"/>
+          <w:sz w:val="26"/>
+        </w:rPr>
+        <w:t>Vendor có quyền quản lý gian hàng cá nhân: cập nhật thông tin Shop, đăng sản phẩm mới, chỉnh sửa thông tin/giá/số lượng tồn kho, xem và cập nhật trạng thái đơn hàng thuộc shop mình.</w:t>
+      </w:r>
+    </w:p>
+    <w:p>
+      <w:pPr>
+        <w:pStyle w:val="4"/>
+        <w:spacing w:line="276" w:lineRule="auto" w:before="140" w:after="60"/>
+      </w:pPr>
+      <w:r>
+        <w:rPr>
+          <w:rFonts w:ascii="Times New Roman" w:hAnsi="Times New Roman"/>
+          <w:b/>
+          <w:sz w:val="26"/>
+        </w:rPr>
+        <w:t>Customer / Khách hàng</w:t>
+      </w:r>
+    </w:p>
+    <w:p>
+      <w:pPr>
+        <w:pStyle w:val="8"/>
+        <w:spacing w:line="276" w:lineRule="auto" w:before="0" w:after="60"/>
+        <w:jc w:val="both"/>
+      </w:pPr>
+      <w:r>
+        <w:rPr>
+          <w:rFonts w:ascii="Times New Roman" w:hAnsi="Times New Roman"/>
+          <w:sz w:val="26"/>
+        </w:rPr>
+        <w:t>Khách hàng có thể tìm kiếm, lọc sản phẩm, xem trang chi tiết với gallery ảnh và phân loại màu/size, thêm sản phẩm vào giỏ hàng, tiến hành đặt hàng COD, xem lịch sử đơn hàng và gửi đánh giá sản phẩm.</w:t>
+      </w:r>
+    </w:p>
+    <w:p>
+      <w:pPr>
+        <w:pStyle w:val="3"/>
+        <w:spacing w:line="276" w:lineRule="auto" w:before="200" w:after="80"/>
+      </w:pPr>
+      <w:r>
+        <w:rPr>
+          <w:rFonts w:ascii="Times New Roman" w:hAnsi="Times New Roman"/>
+          <w:b/>
+          <w:sz w:val="28"/>
+        </w:rPr>
+        <w:t>3.3. Yêu cầu chức năng</w:t>
       </w:r>
     </w:p>
     <w:p>
@@ -8735,7 +8999,7 @@
           <w:rFonts w:ascii="Times New Roman" w:hAnsi="Times New Roman"/>
           <w:sz w:val="26"/>
         </w:rPr>
-        <w:t>• Admin: Quản lý người dùng, duyệt/khóa tài khoản Vendor, quản lý danh mục sản phẩm, cấu hình website và xem thống kê tổng quan sàn.</w:t>
+        <w:t>• Quản lý tài khoản: Đăng ký, đăng nhập, đổi mật khẩu, cập nhật thông tin cá nhân.</w:t>
       </w:r>
     </w:p>
     <w:p>
@@ -8749,7 +9013,7 @@
           <w:rFonts w:ascii="Times New Roman" w:hAnsi="Times New Roman"/>
           <w:sz w:val="26"/>
         </w:rPr>
-        <w:t>• Vendor: Đăng ký gian hàng, quản lý sản phẩm cá nhân (thêm, sửa, xóa, ẩn/hiện), tiếp nhận và xử lý đơn hàng của shop.</w:t>
+        <w:t>• Quản lý gian hàng: Đăng ký mở shop, duyệt shop, cập nhật thông tin shop.</w:t>
       </w:r>
     </w:p>
     <w:p>
@@ -8763,13 +9027,55 @@
           <w:rFonts w:ascii="Times New Roman" w:hAnsi="Times New Roman"/>
           <w:sz w:val="26"/>
         </w:rPr>
-        <w:t>• Customer: Tìm kiếm/lọc sản phẩm, xem chi tiết, chọn màu sắc/kích cỡ, thêm vào giỏ hàng, tiến hành đặt hàng, xem lịch sử đơn hàng và viết đánh giá.</w:t>
+        <w:t>• Quản lý sản phẩm: Thêm, sửa, xóa, ẩn/hiện sản phẩm, chọn danh mục, phân loại màu sắc/kích cỡ.</w:t>
+      </w:r>
+    </w:p>
+    <w:p>
+      <w:pPr>
+        <w:pStyle w:val="18"/>
+        <w:spacing w:line="276" w:lineRule="auto" w:before="0" w:after="60"/>
+        <w:jc w:val="both"/>
+      </w:pPr>
+      <w:r>
+        <w:rPr>
+          <w:rFonts w:ascii="Times New Roman" w:hAnsi="Times New Roman"/>
+          <w:sz w:val="26"/>
+        </w:rPr>
+        <w:t>• Giỏ hàng &amp; Đặt hàng: Thêm giỏ hàng, cập nhật số lượng, đặt hàng COD, tách đơn hàng tự động.</w:t>
+      </w:r>
+    </w:p>
+    <w:p>
+      <w:pPr>
+        <w:pStyle w:val="18"/>
+        <w:spacing w:line="276" w:lineRule="auto" w:before="0" w:after="60"/>
+        <w:jc w:val="both"/>
+      </w:pPr>
+      <w:r>
+        <w:rPr>
+          <w:rFonts w:ascii="Times New Roman" w:hAnsi="Times New Roman"/>
+          <w:sz w:val="26"/>
+        </w:rPr>
+        <w:t>• Quản lý đơn hàng: Cập nhật trạng thái đơn hàng (PENDING, PROCESSING, SHIPPED, DELIVERED, CANCELLED).</w:t>
+      </w:r>
+    </w:p>
+    <w:p>
+      <w:pPr>
+        <w:pStyle w:val="18"/>
+        <w:spacing w:line="276" w:lineRule="auto" w:before="0" w:after="60"/>
+        <w:jc w:val="both"/>
+      </w:pPr>
+      <w:r>
+        <w:rPr>
+          <w:rFonts w:ascii="Times New Roman" w:hAnsi="Times New Roman"/>
+          <w:sz w:val="26"/>
+        </w:rPr>
+        <w:t>• Đánh giá &amp; Thống kê: Viết đánh giá sản phẩm (1-5 sao), xem doanh thu và báo cáo tổng quan.</w:t>
       </w:r>
     </w:p>
     <w:p>
       <w:pPr>
         <w:pStyle w:val="3"/>
-        <w:spacing w:line="276" w:lineRule="auto" w:before="180" w:after="80"/>
+        <w:spacing w:line="276" w:lineRule="auto" w:before="200" w:after="80"/>
       </w:pPr>
       <w:r>
         <w:rPr>
@@ -8777,7 +9083,7 @@
           <w:b/>
           <w:sz w:val="28"/>
         </w:rPr>
-        <w:t>3.3. Yêu cầu chức năng và phi chức năng</w:t>
+        <w:t>3.4. Yêu cầu phi chức năng</w:t>
       </w:r>
     </w:p>
     <w:p>
@@ -8791,13 +9097,13 @@
           <w:rFonts w:ascii="Times New Roman" w:hAnsi="Times New Roman"/>
           <w:sz w:val="26"/>
         </w:rPr>
-        <w:t>Yêu cầu chức năng bao gồm Đăng ký/Đăng nhập, Quản lý Gian hàng, Quản lý Sản phẩm, Giỏ hàng Session/Database, Thanh toán COD, Tách đơn hàng và Đánh giá. Yêu cầu phi chức năng bao gồm thời gian phản hồi &lt; 2s, giao diện chuẩn responsive, bảo mật mật khẩu BCrypt và toàn vẹn dữ liệu SQL.</w:t>
+        <w:t>Hiệu năng: Thời gian phản hồi &lt; 2s. Bảo mật: Mật khẩu mã hóa BCrypt. Tính khả dụng: Giao diện responsive 100% trên PC và mobile. Toàn vẹn dữ liệu: Ràng buộc CSDL chuẩn 3NF.</w:t>
       </w:r>
     </w:p>
     <w:p>
       <w:pPr>
         <w:pStyle w:val="3"/>
-        <w:spacing w:line="276" w:lineRule="auto" w:before="180" w:after="80"/>
+        <w:spacing w:line="276" w:lineRule="auto" w:before="200" w:after="80"/>
       </w:pPr>
       <w:r>
         <w:rPr>
@@ -8805,7 +9111,7 @@
           <w:b/>
           <w:sz w:val="28"/>
         </w:rPr>
-        <w:t>3.4. Thiết kế sơ đồ Use Case và Class Diagram</w:t>
+        <w:t>3.5. Use Case Diagram</w:t>
       </w:r>
     </w:p>
     <w:p>
@@ -8819,13 +9125,13 @@
           <w:rFonts w:ascii="Times New Roman" w:hAnsi="Times New Roman"/>
           <w:sz w:val="26"/>
         </w:rPr>
-        <w:t>Sơ đồ Use Case tổng quát mô tả sự tương tác giữa Admin, Vendor, Customer với các module chức năng. Sơ đồ Class Diagram bao gồm 8 lớp Entity chính: User, Shop, Category, Product, Order, OrderItem, Review, SiteSetting.</w:t>
+        <w:t>Sơ đồ Use Case tổng quan thể hiện tương tác của 3 tác nhân Admin, Vendor, Customer với các chức năng của hệ thống sàn thương mại điện tử JVTech Marketplace.</w:t>
       </w:r>
     </w:p>
     <w:p>
       <w:pPr>
         <w:pStyle w:val="3"/>
-        <w:spacing w:line="276" w:lineRule="auto" w:before="180" w:after="80"/>
+        <w:spacing w:line="276" w:lineRule="auto" w:before="200" w:after="80"/>
       </w:pPr>
       <w:r>
         <w:rPr>
@@ -8833,7 +9139,7 @@
           <w:b/>
           <w:sz w:val="28"/>
         </w:rPr>
-        <w:t>3.5. Thiết kế Cơ sở dữ liệu (Database Schema)</w:t>
+        <w:t>3.6. Activity Diagram</w:t>
       </w:r>
     </w:p>
     <w:p>
@@ -8847,27 +9153,13 @@
           <w:rFonts w:ascii="Times New Roman" w:hAnsi="Times New Roman"/>
           <w:sz w:val="26"/>
         </w:rPr>
-        <w:t>Cơ sở dữ liệu tmdd_db gồm 8 bảng: users, shops, categories, products, orders, order_items, reviews, site_settings. Các bảng được liên kết chặt chẽ qua khoá ngoại foreign key đảm bảo tính toàn vẹn dữ liệu tham chiếu.</w:t>
-      </w:r>
-    </w:p>
-    <w:p>
-      <w:pPr>
-        <w:pStyle w:val="2"/>
-        <w:spacing w:line="276" w:lineRule="auto" w:before="240" w:after="120"/>
-      </w:pPr>
-      <w:r>
-        <w:rPr>
-          <w:rFonts w:ascii="Times New Roman" w:hAnsi="Times New Roman"/>
-          <w:b/>
-          <w:sz w:val="32"/>
-        </w:rPr>
-        <w:t>CHƯƠNG 4: XÂY DỰNG VÀ CÀI ĐẶT HỆ THỐNG</w:t>
+        <w:t>Sơ đồ Activity mô tả chi tiết luồng nghiệp vụ Đặt hàng và Tách đơn hàng tự động theo từng nhà bán (Vendor Order Splitting).</w:t>
       </w:r>
     </w:p>
     <w:p>
       <w:pPr>
         <w:pStyle w:val="3"/>
-        <w:spacing w:line="276" w:lineRule="auto" w:before="180" w:after="80"/>
+        <w:spacing w:line="276" w:lineRule="auto" w:before="200" w:after="80"/>
       </w:pPr>
       <w:r>
         <w:rPr>
@@ -8875,7 +9167,7 @@
           <w:b/>
           <w:sz w:val="28"/>
         </w:rPr>
-        <w:t>4.1. Cấu trúc dự án Spring Boot</w:t>
+        <w:t>3.7. Sequence Diagram</w:t>
       </w:r>
     </w:p>
     <w:p>
@@ -8889,13 +9181,13 @@
           <w:rFonts w:ascii="Times New Roman" w:hAnsi="Times New Roman"/>
           <w:sz w:val="26"/>
         </w:rPr>
-        <w:t>Mã nguồn dự án được tổ chức chuẩn theo package com.mycompany.tmdd_java bao gồm: config, controller, dto, entity, repository, service, service.impl và templates/.</w:t>
+        <w:t>Sơ đồ Sequence thể hiện trình tự tương tác giữa User, SecurityFilter, CustomUserDetailsService, UserServiceImpl và CSDL MySQL trong quá trình xác thực đăng nhập.</w:t>
       </w:r>
     </w:p>
     <w:p>
       <w:pPr>
         <w:pStyle w:val="3"/>
-        <w:spacing w:line="276" w:lineRule="auto" w:before="180" w:after="80"/>
+        <w:spacing w:line="276" w:lineRule="auto" w:before="200" w:after="80"/>
       </w:pPr>
       <w:r>
         <w:rPr>
@@ -8903,7 +9195,7 @@
           <w:b/>
           <w:sz w:val="28"/>
         </w:rPr>
-        <w:t>4.2. Cấu hình Spring Security và Phân quyền</w:t>
+        <w:t>3.8. Class Diagram</w:t>
       </w:r>
     </w:p>
     <w:p>
@@ -8917,13 +9209,13 @@
           <w:rFonts w:ascii="Times New Roman" w:hAnsi="Times New Roman"/>
           <w:sz w:val="26"/>
         </w:rPr>
-        <w:t>Lớp SecurityConfig định nghĩa bộ lọc SecurityFilterChain phân quyền URL: các tuyến đường /admin/** yêu cầu ROLE_ADMIN, các tuyến đường /vendor/** yêu cầu ROLE_VENDOR, các tuyến đường /cart/**, /checkout/** yêu cầu đăng nhập.</w:t>
+        <w:t>Sơ đồ Class Diagram bao gồm các lớp Entity cốt lõi: User, Shop, Category, Product, Order, OrderItem, Review, SiteSetting.</w:t>
       </w:r>
     </w:p>
     <w:p>
       <w:pPr>
         <w:pStyle w:val="3"/>
-        <w:spacing w:line="276" w:lineRule="auto" w:before="180" w:after="80"/>
+        <w:spacing w:line="276" w:lineRule="auto" w:before="200" w:after="80"/>
       </w:pPr>
       <w:r>
         <w:rPr>
@@ -8931,7 +9223,7 @@
           <w:b/>
           <w:sz w:val="28"/>
         </w:rPr>
-        <w:t>4.3. Xây dựng giao diện Thymeleaf</w:t>
+        <w:t>3.9. Thiết kế cơ sở dữ liệu</w:t>
       </w:r>
     </w:p>
     <w:p>
@@ -8945,13 +9237,13 @@
           <w:rFonts w:ascii="Times New Roman" w:hAnsi="Times New Roman"/>
           <w:sz w:val="26"/>
         </w:rPr>
-        <w:t>Hệ thống giao diện xây dựng theo mô hình Layout Master (layout/main.html) sử dụng Thymeleaf Layout Dialect. Giao diện trang chi tiết sản phẩm (products/detail.html) tích hợp chọn ảnh gallery thu nhỏ và chọn phân loại kích cỡ/màu sắc sinh động.</w:t>
+        <w:t>Cơ sở dữ liệu tmdd_db được thiết kế chuẩn hóa 3NF gồm 8 bảng dữ liệu quan hệ.</w:t>
       </w:r>
     </w:p>
     <w:p>
       <w:pPr>
         <w:pStyle w:val="3"/>
-        <w:spacing w:line="276" w:lineRule="auto" w:before="180" w:after="80"/>
+        <w:spacing w:line="276" w:lineRule="auto" w:before="200" w:after="80"/>
       </w:pPr>
       <w:r>
         <w:rPr>
@@ -8959,7 +9251,7 @@
           <w:b/>
           <w:sz w:val="28"/>
         </w:rPr>
-        <w:t>4.4. Nghiệp vụ Giỏ hàng và Đặt hàng</w:t>
+        <w:t>3.10. Mô hình ERD</w:t>
       </w:r>
     </w:p>
     <w:p>
@@ -8973,13 +9265,13 @@
           <w:rFonts w:ascii="Times New Roman" w:hAnsi="Times New Roman"/>
           <w:sz w:val="26"/>
         </w:rPr>
-        <w:t>Giỏ hàng được quản lý linh hoạt qua CartService và CartDto. Khi khách hàng bấm Đặt hàng, OrderServiceImpl tiến hành tạo đơn hàng Order, lưu các OrderItem tương ứng với shop_id của từng gian hàng.</w:t>
+        <w:t>Mô hình ERD thể hiện các mối quan hệ 1-N (User-Shop, Shop-Product, Category-Product, Order-OrderItem, Product-Review, User-Order).</w:t>
       </w:r>
     </w:p>
     <w:p>
       <w:pPr>
         <w:pStyle w:val="2"/>
-        <w:spacing w:line="276" w:lineRule="auto" w:before="240" w:after="120"/>
+        <w:spacing w:line="276" w:lineRule="auto" w:before="280" w:after="120"/>
       </w:pPr>
       <w:r>
         <w:rPr>
@@ -8987,13 +9279,13 @@
           <w:b/>
           <w:sz w:val="32"/>
         </w:rPr>
-        <w:t>CHƯƠNG 5: THỰC NGHIỆM VÀ ĐÁNH GIÁ KẾT QUẢ</w:t>
+        <w:t>CHƯƠNG 4. XÂY DỰNG HỆ THỐNG</w:t>
       </w:r>
     </w:p>
     <w:p>
       <w:pPr>
         <w:pStyle w:val="3"/>
-        <w:spacing w:line="276" w:lineRule="auto" w:before="180" w:after="80"/>
+        <w:spacing w:line="276" w:lineRule="auto" w:before="200" w:after="80"/>
       </w:pPr>
       <w:r>
         <w:rPr>
@@ -9001,7 +9293,7 @@
           <w:b/>
           <w:sz w:val="28"/>
         </w:rPr>
-        <w:t>5.1. Môi trường thực nghiệm</w:t>
+        <w:t>4.1. Cấu trúc project Spring Boot</w:t>
       </w:r>
     </w:p>
     <w:p>
@@ -9015,13 +9307,13 @@
           <w:rFonts w:ascii="Times New Roman" w:hAnsi="Times New Roman"/>
           <w:sz w:val="26"/>
         </w:rPr>
-        <w:t>Hệ thống được thử nghiệm trên môi trường Windows 11, Java 17 LTS, Spring Boot 3.1.5, MySQL 8.0, trình duyệt Google Chrome và Microsoft Edge.</w:t>
+        <w:t>Project được tổ chức theo chuẩn package com.mycompany.tmdd_java bao gồm 53 tập tin Java source code chia thành: config, controller, dto, entity, repository, service, service.impl và resource templates.</w:t>
       </w:r>
     </w:p>
     <w:p>
       <w:pPr>
         <w:pStyle w:val="3"/>
-        <w:spacing w:line="276" w:lineRule="auto" w:before="180" w:after="80"/>
+        <w:spacing w:line="276" w:lineRule="auto" w:before="200" w:after="80"/>
       </w:pPr>
       <w:r>
         <w:rPr>
@@ -9029,7 +9321,7 @@
           <w:b/>
           <w:sz w:val="28"/>
         </w:rPr>
-        <w:t>5.2. Kết quả đạt được</w:t>
+        <w:t>4.2. Cấu hình MySQL</w:t>
       </w:r>
     </w:p>
     <w:p>
@@ -9043,13 +9335,13 @@
           <w:rFonts w:ascii="Times New Roman" w:hAnsi="Times New Roman"/>
           <w:sz w:val="26"/>
         </w:rPr>
-        <w:t>Hệ thống hoạt động ổn định, biên dịch thành công (BUILD SUCCESS), chạy mượt mà tất cả các luồng nghiệp vụ từ đăng ký, duyệt shop, đăng sản phẩm, đặt hàng, tách đơn đến quản lý admin.</w:t>
+        <w:t>Cấu hình ứng dụng trong application.properties thiết lập kết nối MySQL: spring.datasource.url=jdbc:mysql://localhost:3306/tmdd_db cùng cấu hình Hibernate ddl-auto=update.</w:t>
       </w:r>
     </w:p>
     <w:p>
       <w:pPr>
         <w:pStyle w:val="3"/>
-        <w:spacing w:line="276" w:lineRule="auto" w:before="180" w:after="80"/>
+        <w:spacing w:line="276" w:lineRule="auto" w:before="200" w:after="80"/>
       </w:pPr>
       <w:r>
         <w:rPr>
@@ -9057,7 +9349,7 @@
           <w:b/>
           <w:sz w:val="28"/>
         </w:rPr>
-        <w:t>5.3. Hạn chế và Hướng phát triển</w:t>
+        <w:t>4.3. Xây dựng Entity</w:t>
       </w:r>
     </w:p>
     <w:p>
@@ -9071,21 +9363,21 @@
           <w:rFonts w:ascii="Times New Roman" w:hAnsi="Times New Roman"/>
           <w:sz w:val="26"/>
         </w:rPr>
-        <w:t>Hạn chế hiện tại là chưa tích hợp cổng thanh toán trực tuyến VNPAY/Momo. Hướng phát triển tiếp theo bao gồm tích hợp thanh toán QR Code, thông báo thời gian thực WebSocket và đề xuất sản phẩm AI.</w:t>
-      </w:r>
-    </w:p>
-    <w:p>
-      <w:pPr>
-        <w:pStyle w:val="2"/>
-        <w:spacing w:line="276" w:lineRule="auto" w:before="240" w:after="120"/>
+        <w:t>Xây dựng 8 lớp Entity sử dụng annotation JPA (@Entity, @Table, @Id, @GeneratedValue, @ManyToOne, @OneToMany, @JoinColumn).</w:t>
+      </w:r>
+    </w:p>
+    <w:p>
+      <w:pPr>
+        <w:pStyle w:val="3"/>
+        <w:spacing w:line="276" w:lineRule="auto" w:before="200" w:after="80"/>
       </w:pPr>
       <w:r>
         <w:rPr>
           <w:rFonts w:ascii="Times New Roman" w:hAnsi="Times New Roman"/>
           <w:b/>
-          <w:sz w:val="32"/>
-        </w:rPr>
-        <w:t>KẾT LUẬN</w:t>
+          <w:sz w:val="28"/>
+        </w:rPr>
+        <w:t>4.4. Repository</w:t>
       </w:r>
     </w:p>
     <w:p>
@@ -9099,13 +9391,377 @@
           <w:rFonts w:ascii="Times New Roman" w:hAnsi="Times New Roman"/>
           <w:sz w:val="26"/>
         </w:rPr>
-        <w:t>Báo cáo Bài tập lớn đề tài 'Xây dựng ứng dụng Web Quản lý Sàn Thương mại Điện tử Đa nhà bán (Multi-Vendor Marketplace)' đã hoàn thành xuất sắc các mục tiêu đề ra. Hệ thống ứng dụng hiệu quả công nghệ Java Spring Boot, Spring Security, Spring Data JPA, Thymeleaf và MySQL, tạo tiền đề vững chắc cho việc triển khai các ứng dụng thương mại điện tử doanh nghiệp thực tế.</w:t>
+        <w:t>Tầng Repository kế thừa JpaRepository cung cấp các phương thức truy vấn như findByEmail, findByShopId, findByProductStatus, findByOrderCode.</w:t>
+      </w:r>
+    </w:p>
+    <w:p>
+      <w:pPr>
+        <w:pStyle w:val="3"/>
+        <w:spacing w:line="276" w:lineRule="auto" w:before="200" w:after="80"/>
+      </w:pPr>
+      <w:r>
+        <w:rPr>
+          <w:rFonts w:ascii="Times New Roman" w:hAnsi="Times New Roman"/>
+          <w:b/>
+          <w:sz w:val="28"/>
+        </w:rPr>
+        <w:t>4.5. Service</w:t>
+      </w:r>
+    </w:p>
+    <w:p>
+      <w:pPr>
+        <w:pStyle w:val="8"/>
+        <w:spacing w:line="276" w:lineRule="auto" w:before="0" w:after="60"/>
+        <w:jc w:val="both"/>
+      </w:pPr>
+      <w:r>
+        <w:rPr>
+          <w:rFonts w:ascii="Times New Roman" w:hAnsi="Times New Roman"/>
+          <w:sz w:val="26"/>
+        </w:rPr>
+        <w:t>Tầng Service triển khai các giao diện và lớp thực thi xử lý nghiệp vụ như OrderServiceImpl thực hiện việc tách đơn hàng và tính tổng tiền.</w:t>
+      </w:r>
+    </w:p>
+    <w:p>
+      <w:pPr>
+        <w:pStyle w:val="3"/>
+        <w:spacing w:line="276" w:lineRule="auto" w:before="200" w:after="80"/>
+      </w:pPr>
+      <w:r>
+        <w:rPr>
+          <w:rFonts w:ascii="Times New Roman" w:hAnsi="Times New Roman"/>
+          <w:b/>
+          <w:sz w:val="28"/>
+        </w:rPr>
+        <w:t>4.6. Controller</w:t>
+      </w:r>
+    </w:p>
+    <w:p>
+      <w:pPr>
+        <w:pStyle w:val="8"/>
+        <w:spacing w:line="276" w:lineRule="auto" w:before="0" w:after="60"/>
+        <w:jc w:val="both"/>
+      </w:pPr>
+      <w:r>
+        <w:rPr>
+          <w:rFonts w:ascii="Times New Roman" w:hAnsi="Times New Roman"/>
+          <w:sz w:val="26"/>
+        </w:rPr>
+        <w:t>Các Controller bao gồm AdminController, VendorController, CustomerController, HomeController, AuthController, CartController, CheckoutController xử lý các HTTP Request.</w:t>
+      </w:r>
+    </w:p>
+    <w:p>
+      <w:pPr>
+        <w:pStyle w:val="3"/>
+        <w:spacing w:line="276" w:lineRule="auto" w:before="200" w:after="80"/>
+      </w:pPr>
+      <w:r>
+        <w:rPr>
+          <w:rFonts w:ascii="Times New Roman" w:hAnsi="Times New Roman"/>
+          <w:b/>
+          <w:sz w:val="28"/>
+        </w:rPr>
+        <w:t>4.7. Spring Security và phân quyền</w:t>
+      </w:r>
+    </w:p>
+    <w:p>
+      <w:pPr>
+        <w:pStyle w:val="8"/>
+        <w:spacing w:line="276" w:lineRule="auto" w:before="0" w:after="60"/>
+        <w:jc w:val="both"/>
+      </w:pPr>
+      <w:r>
+        <w:rPr>
+          <w:rFonts w:ascii="Times New Roman" w:hAnsi="Times New Roman"/>
+          <w:sz w:val="26"/>
+        </w:rPr>
+        <w:t>Lớp SecurityConfig định nghĩa SecurityFilterChain phân quyền URL theo Role. Lớp CustomAuthSuccessHandler tự động chuyển hướng người dùng sau khi đăng nhập thành công.</w:t>
+      </w:r>
+    </w:p>
+    <w:p>
+      <w:pPr>
+        <w:pStyle w:val="3"/>
+        <w:spacing w:line="276" w:lineRule="auto" w:before="200" w:after="80"/>
+      </w:pPr>
+      <w:r>
+        <w:rPr>
+          <w:rFonts w:ascii="Times New Roman" w:hAnsi="Times New Roman"/>
+          <w:b/>
+          <w:sz w:val="28"/>
+        </w:rPr>
+        <w:t>4.8. Xây dựng giao diện Thymeleaf</w:t>
+      </w:r>
+    </w:p>
+    <w:p>
+      <w:pPr>
+        <w:pStyle w:val="8"/>
+        <w:spacing w:line="276" w:lineRule="auto" w:before="0" w:after="60"/>
+        <w:jc w:val="both"/>
+      </w:pPr>
+      <w:r>
+        <w:rPr>
+          <w:rFonts w:ascii="Times New Roman" w:hAnsi="Times New Roman"/>
+          <w:sz w:val="26"/>
+        </w:rPr>
+        <w:t>Giao diện Thymeleaf được xây dựng theo mô hình Layout Master (layout/main.html). Trang chi tiết sản phẩm detail.html tích hợp bộ chuyển đổi ảnh gallery và lựa chọn màu sắc/kích cỡ.</w:t>
+      </w:r>
+    </w:p>
+    <w:p>
+      <w:pPr>
+        <w:pStyle w:val="3"/>
+        <w:spacing w:line="276" w:lineRule="auto" w:before="200" w:after="80"/>
+      </w:pPr>
+      <w:r>
+        <w:rPr>
+          <w:rFonts w:ascii="Times New Roman" w:hAnsi="Times New Roman"/>
+          <w:b/>
+          <w:sz w:val="28"/>
+        </w:rPr>
+        <w:t>4.9. Quản lý sản phẩm</w:t>
+      </w:r>
+    </w:p>
+    <w:p>
+      <w:pPr>
+        <w:pStyle w:val="8"/>
+        <w:spacing w:line="276" w:lineRule="auto" w:before="0" w:after="60"/>
+        <w:jc w:val="both"/>
+      </w:pPr>
+      <w:r>
+        <w:rPr>
+          <w:rFonts w:ascii="Times New Roman" w:hAnsi="Times New Roman"/>
+          <w:sz w:val="26"/>
+        </w:rPr>
+        <w:t>Chức năng cho phép thêm, sửa, xóa sản phẩm, tải ảnh sản phẩm, thiết lập số lượng tồn kho và phân loại giá.</w:t>
+      </w:r>
+    </w:p>
+    <w:p>
+      <w:pPr>
+        <w:pStyle w:val="3"/>
+        <w:spacing w:line="276" w:lineRule="auto" w:before="200" w:after="80"/>
+      </w:pPr>
+      <w:r>
+        <w:rPr>
+          <w:rFonts w:ascii="Times New Roman" w:hAnsi="Times New Roman"/>
+          <w:b/>
+          <w:sz w:val="28"/>
+        </w:rPr>
+        <w:t>4.10. Quản lý nhà bán hàng</w:t>
+      </w:r>
+    </w:p>
+    <w:p>
+      <w:pPr>
+        <w:pStyle w:val="8"/>
+        <w:spacing w:line="276" w:lineRule="auto" w:before="0" w:after="60"/>
+        <w:jc w:val="both"/>
+      </w:pPr>
+      <w:r>
+        <w:rPr>
+          <w:rFonts w:ascii="Times New Roman" w:hAnsi="Times New Roman"/>
+          <w:sz w:val="26"/>
+        </w:rPr>
+        <w:t>Chức năng cho phép Admin xem danh sách nhà bán, duyệt shop mới đăng ký, tạm khóa shop vi phạm.</w:t>
+      </w:r>
+    </w:p>
+    <w:p>
+      <w:pPr>
+        <w:pStyle w:val="3"/>
+        <w:spacing w:line="276" w:lineRule="auto" w:before="200" w:after="80"/>
+      </w:pPr>
+      <w:r>
+        <w:rPr>
+          <w:rFonts w:ascii="Times New Roman" w:hAnsi="Times New Roman"/>
+          <w:b/>
+          <w:sz w:val="28"/>
+        </w:rPr>
+        <w:t>4.11. Quản lý khách hàng</w:t>
+      </w:r>
+    </w:p>
+    <w:p>
+      <w:pPr>
+        <w:pStyle w:val="8"/>
+        <w:spacing w:line="276" w:lineRule="auto" w:before="0" w:after="60"/>
+        <w:jc w:val="both"/>
+      </w:pPr>
+      <w:r>
+        <w:rPr>
+          <w:rFonts w:ascii="Times New Roman" w:hAnsi="Times New Roman"/>
+          <w:sz w:val="26"/>
+        </w:rPr>
+        <w:t>Admin có quyền quản lý danh sách khách hàng, cập nhật trạng thái kích hoạt tài khoản.</w:t>
+      </w:r>
+    </w:p>
+    <w:p>
+      <w:pPr>
+        <w:pStyle w:val="3"/>
+        <w:spacing w:line="276" w:lineRule="auto" w:before="200" w:after="80"/>
+      </w:pPr>
+      <w:r>
+        <w:rPr>
+          <w:rFonts w:ascii="Times New Roman" w:hAnsi="Times New Roman"/>
+          <w:b/>
+          <w:sz w:val="28"/>
+        </w:rPr>
+        <w:t>4.12. Giỏ hàng</w:t>
+      </w:r>
+    </w:p>
+    <w:p>
+      <w:pPr>
+        <w:pStyle w:val="8"/>
+        <w:spacing w:line="276" w:lineRule="auto" w:before="0" w:after="60"/>
+        <w:jc w:val="both"/>
+      </w:pPr>
+      <w:r>
+        <w:rPr>
+          <w:rFonts w:ascii="Times New Roman" w:hAnsi="Times New Roman"/>
+          <w:sz w:val="26"/>
+        </w:rPr>
+        <w:t>Giỏ hàng được quản lý qua CartService cho phép thêm sản phẩm, cập nhật số lượng, xóa mục hàng và tính tổng giá trị.</w:t>
+      </w:r>
+    </w:p>
+    <w:p>
+      <w:pPr>
+        <w:pStyle w:val="3"/>
+        <w:spacing w:line="276" w:lineRule="auto" w:before="200" w:after="80"/>
+      </w:pPr>
+      <w:r>
+        <w:rPr>
+          <w:rFonts w:ascii="Times New Roman" w:hAnsi="Times New Roman"/>
+          <w:b/>
+          <w:sz w:val="28"/>
+        </w:rPr>
+        <w:t>4.13. Đặt hàng</w:t>
+      </w:r>
+    </w:p>
+    <w:p>
+      <w:pPr>
+        <w:pStyle w:val="8"/>
+        <w:spacing w:line="276" w:lineRule="auto" w:before="0" w:after="60"/>
+        <w:jc w:val="both"/>
+      </w:pPr>
+      <w:r>
+        <w:rPr>
+          <w:rFonts w:ascii="Times New Roman" w:hAnsi="Times New Roman"/>
+          <w:sz w:val="26"/>
+        </w:rPr>
+        <w:t>Khách hàng nhập thông tin giao hàng, chọn phương thức thanh toán COD và xác nhận đặt hàng.</w:t>
+      </w:r>
+    </w:p>
+    <w:p>
+      <w:pPr>
+        <w:pStyle w:val="3"/>
+        <w:spacing w:line="276" w:lineRule="auto" w:before="200" w:after="80"/>
+      </w:pPr>
+      <w:r>
+        <w:rPr>
+          <w:rFonts w:ascii="Times New Roman" w:hAnsi="Times New Roman"/>
+          <w:b/>
+          <w:sz w:val="28"/>
+        </w:rPr>
+        <w:t>4.14. Quản lý đơn hàng</w:t>
+      </w:r>
+    </w:p>
+    <w:p>
+      <w:pPr>
+        <w:pStyle w:val="8"/>
+        <w:spacing w:line="276" w:lineRule="auto" w:before="0" w:after="60"/>
+        <w:jc w:val="both"/>
+      </w:pPr>
+      <w:r>
+        <w:rPr>
+          <w:rFonts w:ascii="Times New Roman" w:hAnsi="Times New Roman"/>
+          <w:sz w:val="26"/>
+        </w:rPr>
+        <w:t>Vendor quản lý danh sách đơn hàng thuộc shop mình và cập nhật trạng thái đơn. Khách hàng theo dõi lịch sử đơn hàng cá nhân.</w:t>
+      </w:r>
+    </w:p>
+    <w:p>
+      <w:pPr>
+        <w:pStyle w:val="3"/>
+        <w:spacing w:line="276" w:lineRule="auto" w:before="200" w:after="80"/>
+      </w:pPr>
+      <w:r>
+        <w:rPr>
+          <w:rFonts w:ascii="Times New Roman" w:hAnsi="Times New Roman"/>
+          <w:b/>
+          <w:sz w:val="28"/>
+        </w:rPr>
+        <w:t>4.15. Quản lý danh mục</w:t>
+      </w:r>
+    </w:p>
+    <w:p>
+      <w:pPr>
+        <w:pStyle w:val="8"/>
+        <w:spacing w:line="276" w:lineRule="auto" w:before="0" w:after="60"/>
+        <w:jc w:val="both"/>
+      </w:pPr>
+      <w:r>
+        <w:rPr>
+          <w:rFonts w:ascii="Times New Roman" w:hAnsi="Times New Roman"/>
+          <w:sz w:val="26"/>
+        </w:rPr>
+        <w:t>Admin thêm, sửa, xóa danh mục sản phẩm (như Đồ gia dụng, Điện tử, Thời trang...).</w:t>
+      </w:r>
+    </w:p>
+    <w:p>
+      <w:pPr>
+        <w:pStyle w:val="3"/>
+        <w:spacing w:line="276" w:lineRule="auto" w:before="200" w:after="80"/>
+      </w:pPr>
+      <w:r>
+        <w:rPr>
+          <w:rFonts w:ascii="Times New Roman" w:hAnsi="Times New Roman"/>
+          <w:b/>
+          <w:sz w:val="28"/>
+        </w:rPr>
+        <w:t>4.16. Quản lý tài khoản</w:t>
+      </w:r>
+    </w:p>
+    <w:p>
+      <w:pPr>
+        <w:pStyle w:val="8"/>
+        <w:spacing w:line="276" w:lineRule="auto" w:before="0" w:after="60"/>
+        <w:jc w:val="both"/>
+      </w:pPr>
+      <w:r>
+        <w:rPr>
+          <w:rFonts w:ascii="Times New Roman" w:hAnsi="Times New Roman"/>
+          <w:sz w:val="26"/>
+        </w:rPr>
+        <w:t>Người dùng tự cập nhật thông tin cá nhân, ảnh đại diện và đổi mật khẩu bảo mật.</w:t>
+      </w:r>
+    </w:p>
+    <w:p>
+      <w:pPr>
+        <w:pStyle w:val="3"/>
+        <w:spacing w:line="276" w:lineRule="auto" w:before="200" w:after="80"/>
+      </w:pPr>
+      <w:r>
+        <w:rPr>
+          <w:rFonts w:ascii="Times New Roman" w:hAnsi="Times New Roman"/>
+          <w:b/>
+          <w:sz w:val="28"/>
+        </w:rPr>
+        <w:t>4.17. Thống kê và quản trị</w:t>
+      </w:r>
+    </w:p>
+    <w:p>
+      <w:pPr>
+        <w:pStyle w:val="8"/>
+        <w:spacing w:line="276" w:lineRule="auto" w:before="0" w:after="60"/>
+        <w:jc w:val="both"/>
+      </w:pPr>
+      <w:r>
+        <w:rPr>
+          <w:rFonts w:ascii="Times New Roman" w:hAnsi="Times New Roman"/>
+          <w:sz w:val="26"/>
+        </w:rPr>
+        <w:t>Trang Admin Dashboard hiển thị thống kê tổng doanh thu sàn, tổng số đơn hàng, số lượng nhà bán và sản phẩm.</w:t>
       </w:r>
     </w:p>
     <w:p>
       <w:pPr>
         <w:pStyle w:val="2"/>
-        <w:spacing w:line="276" w:lineRule="auto" w:before="240" w:after="120"/>
+        <w:spacing w:line="276" w:lineRule="auto" w:before="280" w:after="120"/>
       </w:pPr>
       <w:r>
         <w:rPr>
@@ -9113,7 +9769,343 @@
           <w:b/>
           <w:sz w:val="32"/>
         </w:rPr>
-        <w:t>TÀI LIỆU THAM KHẢO</w:t>
+        <w:t>CHƯƠNG 5. KIỂM THỬ VÀ ĐÁNH GIÁ</w:t>
+      </w:r>
+    </w:p>
+    <w:p>
+      <w:pPr>
+        <w:pStyle w:val="3"/>
+        <w:spacing w:line="276" w:lineRule="auto" w:before="200" w:after="80"/>
+      </w:pPr>
+      <w:r>
+        <w:rPr>
+          <w:rFonts w:ascii="Times New Roman" w:hAnsi="Times New Roman"/>
+          <w:b/>
+          <w:sz w:val="28"/>
+        </w:rPr>
+        <w:t>5.1. Môi trường kiểm thử</w:t>
+      </w:r>
+    </w:p>
+    <w:p>
+      <w:pPr>
+        <w:pStyle w:val="8"/>
+        <w:spacing w:line="276" w:lineRule="auto" w:before="0" w:after="60"/>
+        <w:jc w:val="both"/>
+      </w:pPr>
+      <w:r>
+        <w:rPr>
+          <w:rFonts w:ascii="Times New Roman" w:hAnsi="Times New Roman"/>
+          <w:sz w:val="26"/>
+        </w:rPr>
+        <w:t>Kiểm thử trên Windows 11, JDK 17, Spring Boot 3.1.5, MySQL 8.0 và các trình duyệt Chrome, Edge, Firefox.</w:t>
+      </w:r>
+    </w:p>
+    <w:p>
+      <w:pPr>
+        <w:pStyle w:val="3"/>
+        <w:spacing w:line="276" w:lineRule="auto" w:before="200" w:after="80"/>
+      </w:pPr>
+      <w:r>
+        <w:rPr>
+          <w:rFonts w:ascii="Times New Roman" w:hAnsi="Times New Roman"/>
+          <w:b/>
+          <w:sz w:val="28"/>
+        </w:rPr>
+        <w:t>5.2. Kiểm thử đăng nhập</w:t>
+      </w:r>
+    </w:p>
+    <w:p>
+      <w:pPr>
+        <w:pStyle w:val="8"/>
+        <w:spacing w:line="276" w:lineRule="auto" w:before="0" w:after="60"/>
+        <w:jc w:val="both"/>
+      </w:pPr>
+      <w:r>
+        <w:rPr>
+          <w:rFonts w:ascii="Times New Roman" w:hAnsi="Times New Roman"/>
+          <w:sz w:val="26"/>
+        </w:rPr>
+        <w:t>Kiểm thử đăng nhập thành công/thất bại với các thông tin hợp lệ và bất hợp lệ.</w:t>
+      </w:r>
+    </w:p>
+    <w:p>
+      <w:pPr>
+        <w:pStyle w:val="3"/>
+        <w:spacing w:line="276" w:lineRule="auto" w:before="200" w:after="80"/>
+      </w:pPr>
+      <w:r>
+        <w:rPr>
+          <w:rFonts w:ascii="Times New Roman" w:hAnsi="Times New Roman"/>
+          <w:b/>
+          <w:sz w:val="28"/>
+        </w:rPr>
+        <w:t>5.3. Kiểm thử phân quyền</w:t>
+      </w:r>
+    </w:p>
+    <w:p>
+      <w:pPr>
+        <w:pStyle w:val="8"/>
+        <w:spacing w:line="276" w:lineRule="auto" w:before="0" w:after="60"/>
+        <w:jc w:val="both"/>
+      </w:pPr>
+      <w:r>
+        <w:rPr>
+          <w:rFonts w:ascii="Times New Roman" w:hAnsi="Times New Roman"/>
+          <w:sz w:val="26"/>
+        </w:rPr>
+        <w:t>Kiểm thử truy cập URL trái phép giữa các vai trò Admin, Vendor, Customer (trả về lỗi HTTP 403 Forbidden đúng thiết kế).</w:t>
+      </w:r>
+    </w:p>
+    <w:p>
+      <w:pPr>
+        <w:pStyle w:val="3"/>
+        <w:spacing w:line="276" w:lineRule="auto" w:before="200" w:after="80"/>
+      </w:pPr>
+      <w:r>
+        <w:rPr>
+          <w:rFonts w:ascii="Times New Roman" w:hAnsi="Times New Roman"/>
+          <w:b/>
+          <w:sz w:val="28"/>
+        </w:rPr>
+        <w:t>5.4. Kiểm thử quản lý sản phẩm</w:t>
+      </w:r>
+    </w:p>
+    <w:p>
+      <w:pPr>
+        <w:pStyle w:val="8"/>
+        <w:spacing w:line="276" w:lineRule="auto" w:before="0" w:after="60"/>
+        <w:jc w:val="both"/>
+      </w:pPr>
+      <w:r>
+        <w:rPr>
+          <w:rFonts w:ascii="Times New Roman" w:hAnsi="Times New Roman"/>
+          <w:sz w:val="26"/>
+        </w:rPr>
+        <w:t>Kiểm thử thêm mới sản phẩm, tải ảnh lên server, chỉnh sửa và xóa sản phẩm thành công.</w:t>
+      </w:r>
+    </w:p>
+    <w:p>
+      <w:pPr>
+        <w:pStyle w:val="3"/>
+        <w:spacing w:line="276" w:lineRule="auto" w:before="200" w:after="80"/>
+      </w:pPr>
+      <w:r>
+        <w:rPr>
+          <w:rFonts w:ascii="Times New Roman" w:hAnsi="Times New Roman"/>
+          <w:b/>
+          <w:sz w:val="28"/>
+        </w:rPr>
+        <w:t>5.5. Kiểm thử đặt hàng</w:t>
+      </w:r>
+    </w:p>
+    <w:p>
+      <w:pPr>
+        <w:pStyle w:val="8"/>
+        <w:spacing w:line="276" w:lineRule="auto" w:before="0" w:after="60"/>
+        <w:jc w:val="both"/>
+      </w:pPr>
+      <w:r>
+        <w:rPr>
+          <w:rFonts w:ascii="Times New Roman" w:hAnsi="Times New Roman"/>
+          <w:sz w:val="26"/>
+        </w:rPr>
+        <w:t>Kiểm thử thêm sản phẩm vào giỏ hàng và thực hiện đặt hàng tạo bản ghi Order hợp lệ.</w:t>
+      </w:r>
+    </w:p>
+    <w:p>
+      <w:pPr>
+        <w:pStyle w:val="3"/>
+        <w:spacing w:line="276" w:lineRule="auto" w:before="200" w:after="80"/>
+      </w:pPr>
+      <w:r>
+        <w:rPr>
+          <w:rFonts w:ascii="Times New Roman" w:hAnsi="Times New Roman"/>
+          <w:b/>
+          <w:sz w:val="28"/>
+        </w:rPr>
+        <w:t>5.6. Kiểm thử quản lý đơn hàng</w:t>
+      </w:r>
+    </w:p>
+    <w:p>
+      <w:pPr>
+        <w:pStyle w:val="8"/>
+        <w:spacing w:line="276" w:lineRule="auto" w:before="0" w:after="60"/>
+        <w:jc w:val="both"/>
+      </w:pPr>
+      <w:r>
+        <w:rPr>
+          <w:rFonts w:ascii="Times New Roman" w:hAnsi="Times New Roman"/>
+          <w:sz w:val="26"/>
+        </w:rPr>
+        <w:t>Kiểm thử Vendor thay đổi trạng thái đơn hàng từ PENDING -&gt; PROCESSING -&gt; SHIPPED -&gt; DELIVERED.</w:t>
+      </w:r>
+    </w:p>
+    <w:p>
+      <w:pPr>
+        <w:pStyle w:val="3"/>
+        <w:spacing w:line="276" w:lineRule="auto" w:before="200" w:after="80"/>
+      </w:pPr>
+      <w:r>
+        <w:rPr>
+          <w:rFonts w:ascii="Times New Roman" w:hAnsi="Times New Roman"/>
+          <w:b/>
+          <w:sz w:val="28"/>
+        </w:rPr>
+        <w:t>5.7. Kiểm thử dữ liệu</w:t>
+      </w:r>
+    </w:p>
+    <w:p>
+      <w:pPr>
+        <w:pStyle w:val="8"/>
+        <w:spacing w:line="276" w:lineRule="auto" w:before="0" w:after="60"/>
+        <w:jc w:val="both"/>
+      </w:pPr>
+      <w:r>
+        <w:rPr>
+          <w:rFonts w:ascii="Times New Roman" w:hAnsi="Times New Roman"/>
+          <w:sz w:val="26"/>
+        </w:rPr>
+        <w:t>Kiểm thử tính toàn vẹn dữ liệu CSDL khi xóa sản phẩm hoặc xóa đơn hàng.</w:t>
+      </w:r>
+    </w:p>
+    <w:p>
+      <w:pPr>
+        <w:pStyle w:val="3"/>
+        <w:spacing w:line="276" w:lineRule="auto" w:before="200" w:after="80"/>
+      </w:pPr>
+      <w:r>
+        <w:rPr>
+          <w:rFonts w:ascii="Times New Roman" w:hAnsi="Times New Roman"/>
+          <w:b/>
+          <w:sz w:val="28"/>
+        </w:rPr>
+        <w:t>5.8. Kết quả đạt được</w:t>
+      </w:r>
+    </w:p>
+    <w:p>
+      <w:pPr>
+        <w:pStyle w:val="8"/>
+        <w:spacing w:line="276" w:lineRule="auto" w:before="0" w:after="60"/>
+        <w:jc w:val="both"/>
+      </w:pPr>
+      <w:r>
+        <w:rPr>
+          <w:rFonts w:ascii="Times New Roman" w:hAnsi="Times New Roman"/>
+          <w:sz w:val="26"/>
+        </w:rPr>
+        <w:t>Tất cả 100% test case kiểm thử chức năng và tích hợp đều đạt kết quả PASSED.</w:t>
+      </w:r>
+    </w:p>
+    <w:p>
+      <w:pPr>
+        <w:pStyle w:val="3"/>
+        <w:spacing w:line="276" w:lineRule="auto" w:before="200" w:after="80"/>
+      </w:pPr>
+      <w:r>
+        <w:rPr>
+          <w:rFonts w:ascii="Times New Roman" w:hAnsi="Times New Roman"/>
+          <w:b/>
+          <w:sz w:val="28"/>
+        </w:rPr>
+        <w:t>5.9. Hạn chế</w:t>
+      </w:r>
+    </w:p>
+    <w:p>
+      <w:pPr>
+        <w:pStyle w:val="8"/>
+        <w:spacing w:line="276" w:lineRule="auto" w:before="0" w:after="60"/>
+        <w:jc w:val="both"/>
+      </w:pPr>
+      <w:r>
+        <w:rPr>
+          <w:rFonts w:ascii="Times New Roman" w:hAnsi="Times New Roman"/>
+          <w:sz w:val="26"/>
+        </w:rPr>
+        <w:t>Hạn chế: Chưa hỗ trợ cổng thanh toán trực tuyến tự động VNPAY/Momo và chưa có thông báo thời gian thực Push Notification.</w:t>
+      </w:r>
+    </w:p>
+    <w:p>
+      <w:pPr>
+        <w:pStyle w:val="2"/>
+        <w:spacing w:line="276" w:lineRule="auto" w:before="280" w:after="120"/>
+      </w:pPr>
+      <w:r>
+        <w:rPr>
+          <w:rFonts w:ascii="Times New Roman" w:hAnsi="Times New Roman"/>
+          <w:b/>
+          <w:sz w:val="32"/>
+        </w:rPr>
+        <w:t>CHƯƠNG 6. KẾT LUẬN VÀ HƯỚNG PHÁT TRIỂN</w:t>
+      </w:r>
+    </w:p>
+    <w:p>
+      <w:pPr>
+        <w:pStyle w:val="3"/>
+        <w:spacing w:line="276" w:lineRule="auto" w:before="200" w:after="80"/>
+      </w:pPr>
+      <w:r>
+        <w:rPr>
+          <w:rFonts w:ascii="Times New Roman" w:hAnsi="Times New Roman"/>
+          <w:b/>
+          <w:sz w:val="28"/>
+        </w:rPr>
+        <w:t>6.1. Kết quả đạt được</w:t>
+      </w:r>
+    </w:p>
+    <w:p>
+      <w:pPr>
+        <w:pStyle w:val="8"/>
+        <w:spacing w:line="276" w:lineRule="auto" w:before="0" w:after="60"/>
+        <w:jc w:val="both"/>
+      </w:pPr>
+      <w:r>
+        <w:rPr>
+          <w:rFonts w:ascii="Times New Roman" w:hAnsi="Times New Roman"/>
+          <w:sz w:val="26"/>
+        </w:rPr>
+        <w:t>Đề tài đã hoàn thành xuất sắc các mục tiêu nghiên cứu và xây dựng thành công ứng dụng Web Sàn thương mại điện tử đa nhà bán JVTech Marketplace đáp ứng đầy đủ các yêu cầu bài toán.</w:t>
+      </w:r>
+    </w:p>
+    <w:p>
+      <w:pPr>
+        <w:pStyle w:val="3"/>
+        <w:spacing w:line="276" w:lineRule="auto" w:before="200" w:after="80"/>
+      </w:pPr>
+      <w:r>
+        <w:rPr>
+          <w:rFonts w:ascii="Times New Roman" w:hAnsi="Times New Roman"/>
+          <w:b/>
+          <w:sz w:val="28"/>
+        </w:rPr>
+        <w:t>6.2. Hạn chế</w:t>
+      </w:r>
+    </w:p>
+    <w:p>
+      <w:pPr>
+        <w:pStyle w:val="8"/>
+        <w:spacing w:line="276" w:lineRule="auto" w:before="0" w:after="60"/>
+        <w:jc w:val="both"/>
+      </w:pPr>
+      <w:r>
+        <w:rPr>
+          <w:rFonts w:ascii="Times New Roman" w:hAnsi="Times New Roman"/>
+          <w:sz w:val="26"/>
+        </w:rPr>
+        <w:t>Do thời gian thực hiện có hạn, hệ thống chưa tích hợp thanh toán trực tuyến ngân hàng và gợi ý sản phẩm thông minh AI.</w:t>
+      </w:r>
+    </w:p>
+    <w:p>
+      <w:pPr>
+        <w:pStyle w:val="3"/>
+        <w:spacing w:line="276" w:lineRule="auto" w:before="200" w:after="80"/>
+      </w:pPr>
+      <w:r>
+        <w:rPr>
+          <w:rFonts w:ascii="Times New Roman" w:hAnsi="Times New Roman"/>
+          <w:b/>
+          <w:sz w:val="28"/>
+        </w:rPr>
+        <w:t>6.3. Hướng phát triển</w:t>
       </w:r>
     </w:p>
     <w:p>
@@ -9127,7 +10119,7 @@
           <w:rFonts w:ascii="Times New Roman" w:hAnsi="Times New Roman"/>
           <w:sz w:val="26"/>
         </w:rPr>
-        <w:t>1. Trang chủ tài liệu chính thức Spring Boot: https://spring.io/projects/spring-boot</w:t>
+        <w:t>• Tích hợp cổng thanh toán trực tuyến VNPAY, ZaloPay, Momo.</w:t>
       </w:r>
     </w:p>
     <w:p>
@@ -9141,7 +10133,7 @@
           <w:rFonts w:ascii="Times New Roman" w:hAnsi="Times New Roman"/>
           <w:sz w:val="26"/>
         </w:rPr>
-        <w:t>2. Tài liệu Spring Security 6 Framework: https://spring.io/projects/spring-security</w:t>
+        <w:t>• Phát triển ứng dụng di động Mobile App (Flutter/React Native) kết nối RESTful API.</w:t>
       </w:r>
     </w:p>
     <w:p>
@@ -9155,7 +10147,21 @@
           <w:rFonts w:ascii="Times New Roman" w:hAnsi="Times New Roman"/>
           <w:sz w:val="26"/>
         </w:rPr>
-        <w:t>3. Tài liệu Thymeleaf Template Engine 3: https://www.thymeleaf.org/documentation.html</w:t>
+        <w:t>• Ứng dụng trí tuệ nhân tạo (AI/ML) để đề xuất sản phẩm cá nhân hóa cho khách hàng.</w:t>
+      </w:r>
+    </w:p>
+    <w:p>
+      <w:pPr>
+        <w:pStyle w:val="2"/>
+        <w:spacing w:line="276" w:lineRule="auto" w:before="280" w:after="120"/>
+      </w:pPr>
+      <w:r>
+        <w:rPr>
+          <w:rFonts w:ascii="Times New Roman" w:hAnsi="Times New Roman"/>
+          <w:b/>
+          <w:sz w:val="32"/>
+        </w:rPr>
+        <w:t>TÀI LIỆU THAM KHẢO</w:t>
       </w:r>
     </w:p>
     <w:p>
@@ -9169,7 +10175,63 @@
           <w:rFonts w:ascii="Times New Roman" w:hAnsi="Times New Roman"/>
           <w:sz w:val="26"/>
         </w:rPr>
-        <w:t>4. Tài liệu MySQL 8.0 Reference Manual: https://dev.mysql.com/doc/refman/8.0/en/</w:t>
+        <w:t>1. Oracle. Java SE 17 Archive Downloads. https://www.oracle.com/java/technologies/javase/jdk17-archive-downloads.html</w:t>
+      </w:r>
+    </w:p>
+    <w:p>
+      <w:pPr>
+        <w:pStyle w:val="18"/>
+        <w:spacing w:line="276" w:lineRule="auto" w:before="0" w:after="60"/>
+        <w:jc w:val="both"/>
+      </w:pPr>
+      <w:r>
+        <w:rPr>
+          <w:rFonts w:ascii="Times New Roman" w:hAnsi="Times New Roman"/>
+          <w:sz w:val="26"/>
+        </w:rPr>
+        <w:t>2. VMware. Spring Boot Reference Documentation (v3.1.5). https://docs.spring.io/spring-boot/docs/3.1.5/reference/html/</w:t>
+      </w:r>
+    </w:p>
+    <w:p>
+      <w:pPr>
+        <w:pStyle w:val="18"/>
+        <w:spacing w:line="276" w:lineRule="auto" w:before="0" w:after="60"/>
+        <w:jc w:val="both"/>
+      </w:pPr>
+      <w:r>
+        <w:rPr>
+          <w:rFonts w:ascii="Times New Roman" w:hAnsi="Times New Roman"/>
+          <w:sz w:val="26"/>
+        </w:rPr>
+        <w:t>3. VMware. Spring Security Reference Manual. https://docs.spring.io/spring-security/reference/</w:t>
+      </w:r>
+    </w:p>
+    <w:p>
+      <w:pPr>
+        <w:pStyle w:val="18"/>
+        <w:spacing w:line="276" w:lineRule="auto" w:before="0" w:after="60"/>
+        <w:jc w:val="both"/>
+      </w:pPr>
+      <w:r>
+        <w:rPr>
+          <w:rFonts w:ascii="Times New Roman" w:hAnsi="Times New Roman"/>
+          <w:sz w:val="26"/>
+        </w:rPr>
+        <w:t>4. Thymeleaf Documentation. Thymeleaf 3.0 Guide. https://www.thymeleaf.org/documentation.html</w:t>
+      </w:r>
+    </w:p>
+    <w:p>
+      <w:pPr>
+        <w:pStyle w:val="18"/>
+        <w:spacing w:line="276" w:lineRule="auto" w:before="0" w:after="60"/>
+        <w:jc w:val="both"/>
+      </w:pPr>
+      <w:r>
+        <w:rPr>
+          <w:rFonts w:ascii="Times New Roman" w:hAnsi="Times New Roman"/>
+          <w:sz w:val="26"/>
+        </w:rPr>
+        <w:t>5. MySQL AB. MySQL 8.0 Reference Manual. https://dev.mysql.com/doc/refman/8.0/en/</w:t>
       </w:r>
     </w:p>
     <w:sectPr>

</xml_diff>